<commit_message>
Retrain Tmax bias correction on all 81 districts
Leave-one-year-out (2024-2025, 56,538 forecast/ERA5 day pairs):
coastal 0.85 -> 0.61 C, hills 1.00 -> 0.76 C, plains 0.65 -> 0.54 C.
The hills model now learns from 12 hill districts instead of Shimla alone.
Overview (md + docx), demo script and limitations updated to match.

Co-Authored-By: Claude Opus 5.5 <noreply@anthropic.com>
</commit_message>
<xml_diff>
--- a/docs/PROJECT_OVERVIEW.docx
+++ b/docs/PROJECT_OVERVIEW.docx
@@ -7621,7 +7621,7 @@
                 <w:sz w:val="18"/>
                 <w:szCs w:val="18"/>
               </w:rPr>
-              <w:t xml:space="preserve">2,792</w:t>
+              <w:t xml:space="preserve">4,188</w:t>
             </w:r>
           </w:p>
         </w:tc>
@@ -7651,7 +7651,7 @@
                 <w:sz w:val="18"/>
                 <w:szCs w:val="18"/>
               </w:rPr>
-              <w:t xml:space="preserve">0.77 °C</w:t>
+              <w:t xml:space="preserve">0.85 °C</w:t>
             </w:r>
           </w:p>
         </w:tc>
@@ -7681,7 +7681,7 @@
                 <w:sz w:val="18"/>
                 <w:szCs w:val="18"/>
               </w:rPr>
-              <w:t xml:space="preserve">0.55 °C</w:t>
+              <w:t xml:space="preserve">0.61 °C</w:t>
             </w:r>
           </w:p>
         </w:tc>
@@ -7776,7 +7776,7 @@
                 <w:sz w:val="18"/>
                 <w:szCs w:val="18"/>
               </w:rPr>
-              <w:t xml:space="preserve">698</w:t>
+              <w:t xml:space="preserve">8,376</w:t>
             </w:r>
           </w:p>
         </w:tc>
@@ -7806,7 +7806,7 @@
                 <w:sz w:val="18"/>
                 <w:szCs w:val="18"/>
               </w:rPr>
-              <w:t xml:space="preserve">0.72 °C</w:t>
+              <w:t xml:space="preserve">1.00 °C</w:t>
             </w:r>
           </w:p>
         </w:tc>
@@ -7836,7 +7836,7 @@
                 <w:sz w:val="18"/>
                 <w:szCs w:val="18"/>
               </w:rPr>
-              <w:t xml:space="preserve">0.67 °C</w:t>
+              <w:t xml:space="preserve">0.76 °C</w:t>
             </w:r>
           </w:p>
         </w:tc>
@@ -7931,7 +7931,7 @@
                 <w:sz w:val="18"/>
                 <w:szCs w:val="18"/>
               </w:rPr>
-              <w:t xml:space="preserve">16,752</w:t>
+              <w:t xml:space="preserve">43,974</w:t>
             </w:r>
           </w:p>
         </w:tc>
@@ -7961,7 +7961,7 @@
                 <w:sz w:val="18"/>
                 <w:szCs w:val="18"/>
               </w:rPr>
-              <w:t xml:space="preserve">0.63 °C</w:t>
+              <w:t xml:space="preserve">0.65 °C</w:t>
             </w:r>
           </w:p>
         </w:tc>
@@ -7991,7 +7991,7 @@
                 <w:sz w:val="18"/>
                 <w:szCs w:val="18"/>
               </w:rPr>
-              <w:t xml:space="preserve">0.52 °C</w:t>
+              <w:t xml:space="preserve">0.54 °C</w:t>
             </w:r>
           </w:p>
         </w:tc>
@@ -8034,17 +8034,7 @@
     </w:p>
     <w:p>
       <w:r>
-        <w:t xml:space="preserve">Trained on 20,242 forecast/ERA5 day pairs from the original 29 districts; the hills model came from one hills district (Shimla). Retraining with all 81 districts is in progress; the dashboard's </w:t>
-      </w:r>
-      <w:r>
-        <w:rPr>
-          <w:i/>
-          <w:iCs/>
-        </w:rPr>
-        <w:t xml:space="preserve">AI bias correction</w:t>
-      </w:r>
-      <w:r>
-        <w:t xml:space="preserve"> panel always shows the current model card.</w:t>
+        <w:t xml:space="preserve">Trained on 56,538 forecast/ERA5 day pairs from all 81 districts.</w:t>
       </w:r>
     </w:p>
     <w:p>

</xml_diff>

<commit_message>
docs: update Word overview for all-India coverage and hot-night rule
Co-Authored-By: Claude Opus 5.5 <noreply@anthropic.com>
</commit_message>
<xml_diff>
--- a/docs/PROJECT_OVERVIEW.docx
+++ b/docs/PROJECT_OVERVIEW.docx
@@ -442,7 +442,7 @@
                 <w:sz w:val="18"/>
                 <w:szCs w:val="18"/>
               </w:rPr>
-              <w:t xml:space="preserve">81 (Census 2011 boundaries) across 19 states and union territories</w:t>
+              <w:t xml:space="preserve">All 641 Census 2011 districts, every state and union territory</w:t>
             </w:r>
           </w:p>
         </w:tc>
@@ -637,7 +637,7 @@
                 <w:sz w:val="18"/>
                 <w:szCs w:val="18"/>
               </w:rPr>
-              <w:t xml:space="preserve">1991–2020 daily normals per district (ERA5 reanalysis)</w:t>
+              <w:t xml:space="preserve">1991–2020 daily normals per district (Copernicus ERA5, adjusted to each forecast point's elevation)</w:t>
             </w:r>
           </w:p>
         </w:tc>
@@ -3195,9 +3195,9 @@
         </w:tblBorders>
       </w:tblPr>
       <w:tblGrid>
-        <w:gridCol w:w="2538"/>
-        <w:gridCol w:w="3384"/>
-        <w:gridCol w:w="3384"/>
+        <w:gridCol w:w="3447"/>
+        <w:gridCol w:w="2413"/>
+        <w:gridCol w:w="3446"/>
       </w:tblGrid>
       <w:tr>
         <w:trPr>
@@ -3205,7 +3205,7 @@
         </w:trPr>
         <w:tc>
           <w:tcPr>
-            <w:tcW w:type="dxa" w:w="2538"/>
+            <w:tcW w:type="dxa" w:w="3447"/>
             <w:tcBorders>
               <w:top w:val="single" w:color="CCD4CC" w:sz="4"/>
               <w:left w:val="single" w:color="CCD4CC" w:sz="4"/>
@@ -3238,7 +3238,7 @@
         </w:tc>
         <w:tc>
           <w:tcPr>
-            <w:tcW w:type="dxa" w:w="3384"/>
+            <w:tcW w:type="dxa" w:w="2413"/>
             <w:tcBorders>
               <w:top w:val="single" w:color="CCD4CC" w:sz="4"/>
               <w:left w:val="single" w:color="CCD4CC" w:sz="4"/>
@@ -3271,7 +3271,7 @@
         </w:tc>
         <w:tc>
           <w:tcPr>
-            <w:tcW w:type="dxa" w:w="3384"/>
+            <w:tcW w:type="dxa" w:w="3446"/>
             <w:tcBorders>
               <w:top w:val="single" w:color="CCD4CC" w:sz="4"/>
               <w:left w:val="single" w:color="CCD4CC" w:sz="4"/>
@@ -3309,7 +3309,7 @@
         </w:trPr>
         <w:tc>
           <w:tcPr>
-            <w:tcW w:type="dxa" w:w="2538"/>
+            <w:tcW w:type="dxa" w:w="3447"/>
             <w:tcBorders>
               <w:top w:val="single" w:color="CCD4CC" w:sz="4"/>
               <w:left w:val="single" w:color="CCD4CC" w:sz="4"/>
@@ -3348,7 +3348,7 @@
         </w:tc>
         <w:tc>
           <w:tcPr>
-            <w:tcW w:type="dxa" w:w="3384"/>
+            <w:tcW w:type="dxa" w:w="2413"/>
             <w:tcBorders>
               <w:top w:val="single" w:color="CCD4CC" w:sz="4"/>
               <w:left w:val="single" w:color="CCD4CC" w:sz="4"/>
@@ -3378,7 +3378,7 @@
         </w:tc>
         <w:tc>
           <w:tcPr>
-            <w:tcW w:type="dxa" w:w="3384"/>
+            <w:tcW w:type="dxa" w:w="3446"/>
             <w:tcBorders>
               <w:top w:val="single" w:color="CCD4CC" w:sz="4"/>
               <w:left w:val="single" w:color="CCD4CC" w:sz="4"/>
@@ -3413,91 +3413,91 @@
         </w:trPr>
         <w:tc>
           <w:tcPr>
-            <w:tcW w:type="dxa" w:w="2538"/>
-            <w:tcBorders>
-              <w:top w:val="single" w:color="CCD4CC" w:sz="4"/>
-              <w:left w:val="single" w:color="CCD4CC" w:sz="4"/>
-              <w:bottom w:val="single" w:color="CCD4CC" w:sz="4"/>
-              <w:right w:val="single" w:color="CCD4CC" w:sz="4"/>
-            </w:tcBorders>
-            <w:tcMar>
-              <w:top w:type="dxa" w:w="60"/>
-              <w:left w:type="dxa" w:w="100"/>
-              <w:bottom w:type="dxa" w:w="60"/>
-              <w:right w:type="dxa" w:w="100"/>
-            </w:tcMar>
-          </w:tcPr>
-          <w:p>
-            <w:pPr>
-              <w:spacing w:after="0"/>
-            </w:pPr>
-            <w:r>
-              <w:rPr>
-                <w:color w:val="14251F"/>
-                <w:sz w:val="18"/>
-                <w:szCs w:val="18"/>
-              </w:rPr>
-              <w:t xml:space="preserve">Open-Meteo historical archive (ERA5)</w:t>
-            </w:r>
-          </w:p>
-        </w:tc>
-        <w:tc>
-          <w:tcPr>
-            <w:tcW w:type="dxa" w:w="3384"/>
-            <w:tcBorders>
-              <w:top w:val="single" w:color="CCD4CC" w:sz="4"/>
-              <w:left w:val="single" w:color="CCD4CC" w:sz="4"/>
-              <w:bottom w:val="single" w:color="CCD4CC" w:sz="4"/>
-              <w:right w:val="single" w:color="CCD4CC" w:sz="4"/>
-            </w:tcBorders>
-            <w:tcMar>
-              <w:top w:type="dxa" w:w="60"/>
-              <w:left w:type="dxa" w:w="100"/>
-              <w:bottom w:type="dxa" w:w="60"/>
-              <w:right w:type="dxa" w:w="100"/>
-            </w:tcMar>
-          </w:tcPr>
-          <w:p>
-            <w:pPr>
-              <w:spacing w:after="0"/>
-            </w:pPr>
-            <w:r>
-              <w:rPr>
-                <w:color w:val="14251F"/>
-                <w:sz w:val="18"/>
-                <w:szCs w:val="18"/>
-              </w:rPr>
-              <w:t xml:space="preserve">1991–2020 normals, historical replays, bias-correction target</w:t>
-            </w:r>
-          </w:p>
-        </w:tc>
-        <w:tc>
-          <w:tcPr>
-            <w:tcW w:type="dxa" w:w="3384"/>
-            <w:tcBorders>
-              <w:top w:val="single" w:color="CCD4CC" w:sz="4"/>
-              <w:left w:val="single" w:color="CCD4CC" w:sz="4"/>
-              <w:bottom w:val="single" w:color="CCD4CC" w:sz="4"/>
-              <w:right w:val="single" w:color="CCD4CC" w:sz="4"/>
-            </w:tcBorders>
-            <w:tcMar>
-              <w:top w:type="dxa" w:w="60"/>
-              <w:left w:type="dxa" w:w="100"/>
-              <w:bottom w:type="dxa" w:w="60"/>
-              <w:right w:type="dxa" w:w="100"/>
-            </w:tcMar>
-          </w:tcPr>
-          <w:p>
-            <w:pPr>
-              <w:spacing w:after="0"/>
-            </w:pPr>
-            <w:r>
-              <w:rPr>
-                <w:color w:val="14251F"/>
-                <w:sz w:val="18"/>
-                <w:szCs w:val="18"/>
-              </w:rPr>
-              <w:t xml:space="preserve">CC BY 4.0 (Copernicus ERA5)</w:t>
+            <w:tcW w:type="dxa" w:w="3447"/>
+            <w:tcBorders>
+              <w:top w:val="single" w:color="CCD4CC" w:sz="4"/>
+              <w:left w:val="single" w:color="CCD4CC" w:sz="4"/>
+              <w:bottom w:val="single" w:color="CCD4CC" w:sz="4"/>
+              <w:right w:val="single" w:color="CCD4CC" w:sz="4"/>
+            </w:tcBorders>
+            <w:tcMar>
+              <w:top w:type="dxa" w:w="60"/>
+              <w:left w:type="dxa" w:w="100"/>
+              <w:bottom w:type="dxa" w:w="60"/>
+              <w:right w:type="dxa" w:w="100"/>
+            </w:tcMar>
+          </w:tcPr>
+          <w:p>
+            <w:pPr>
+              <w:spacing w:after="0"/>
+            </w:pPr>
+            <w:r>
+              <w:rPr>
+                <w:color w:val="14251F"/>
+                <w:sz w:val="18"/>
+                <w:szCs w:val="18"/>
+              </w:rPr>
+              <w:t xml:space="preserve">Copernicus Climate Data Store, ERA5 hourly 2 m temperature and orography</w:t>
+            </w:r>
+          </w:p>
+        </w:tc>
+        <w:tc>
+          <w:tcPr>
+            <w:tcW w:type="dxa" w:w="2413"/>
+            <w:tcBorders>
+              <w:top w:val="single" w:color="CCD4CC" w:sz="4"/>
+              <w:left w:val="single" w:color="CCD4CC" w:sz="4"/>
+              <w:bottom w:val="single" w:color="CCD4CC" w:sz="4"/>
+              <w:right w:val="single" w:color="CCD4CC" w:sz="4"/>
+            </w:tcBorders>
+            <w:tcMar>
+              <w:top w:type="dxa" w:w="60"/>
+              <w:left w:type="dxa" w:w="100"/>
+              <w:bottom w:type="dxa" w:w="60"/>
+              <w:right w:type="dxa" w:w="100"/>
+            </w:tcMar>
+          </w:tcPr>
+          <w:p>
+            <w:pPr>
+              <w:spacing w:after="0"/>
+            </w:pPr>
+            <w:r>
+              <w:rPr>
+                <w:color w:val="14251F"/>
+                <w:sz w:val="18"/>
+                <w:szCs w:val="18"/>
+              </w:rPr>
+              <w:t xml:space="preserve">1991–2020 normals for all districts</w:t>
+            </w:r>
+          </w:p>
+        </w:tc>
+        <w:tc>
+          <w:tcPr>
+            <w:tcW w:type="dxa" w:w="3446"/>
+            <w:tcBorders>
+              <w:top w:val="single" w:color="CCD4CC" w:sz="4"/>
+              <w:left w:val="single" w:color="CCD4CC" w:sz="4"/>
+              <w:bottom w:val="single" w:color="CCD4CC" w:sz="4"/>
+              <w:right w:val="single" w:color="CCD4CC" w:sz="4"/>
+            </w:tcBorders>
+            <w:tcMar>
+              <w:top w:type="dxa" w:w="60"/>
+              <w:left w:type="dxa" w:w="100"/>
+              <w:bottom w:type="dxa" w:w="60"/>
+              <w:right w:type="dxa" w:w="100"/>
+            </w:tcMar>
+          </w:tcPr>
+          <w:p>
+            <w:pPr>
+              <w:spacing w:after="0"/>
+            </w:pPr>
+            <w:r>
+              <w:rPr>
+                <w:color w:val="14251F"/>
+                <w:sz w:val="18"/>
+                <w:szCs w:val="18"/>
+              </w:rPr>
+              <w:t xml:space="preserve">CC BY 4.0</w:t>
             </w:r>
           </w:p>
         </w:tc>
@@ -3508,91 +3508,91 @@
         </w:trPr>
         <w:tc>
           <w:tcPr>
-            <w:tcW w:type="dxa" w:w="2538"/>
-            <w:tcBorders>
-              <w:top w:val="single" w:color="CCD4CC" w:sz="4"/>
-              <w:left w:val="single" w:color="CCD4CC" w:sz="4"/>
-              <w:bottom w:val="single" w:color="CCD4CC" w:sz="4"/>
-              <w:right w:val="single" w:color="CCD4CC" w:sz="4"/>
-            </w:tcBorders>
-            <w:tcMar>
-              <w:top w:type="dxa" w:w="60"/>
-              <w:left w:type="dxa" w:w="100"/>
-              <w:bottom w:type="dxa" w:w="60"/>
-              <w:right w:type="dxa" w:w="100"/>
-            </w:tcMar>
-          </w:tcPr>
-          <w:p>
-            <w:pPr>
-              <w:spacing w:after="0"/>
-            </w:pPr>
-            <w:r>
-              <w:rPr>
-                <w:color w:val="14251F"/>
-                <w:sz w:val="18"/>
-                <w:szCs w:val="18"/>
-              </w:rPr>
-              <w:t xml:space="preserve">Open-Meteo historical forecast API (IFS)</w:t>
-            </w:r>
-          </w:p>
-        </w:tc>
-        <w:tc>
-          <w:tcPr>
-            <w:tcW w:type="dxa" w:w="3384"/>
-            <w:tcBorders>
-              <w:top w:val="single" w:color="CCD4CC" w:sz="4"/>
-              <w:left w:val="single" w:color="CCD4CC" w:sz="4"/>
-              <w:bottom w:val="single" w:color="CCD4CC" w:sz="4"/>
-              <w:right w:val="single" w:color="CCD4CC" w:sz="4"/>
-            </w:tcBorders>
-            <w:tcMar>
-              <w:top w:type="dxa" w:w="60"/>
-              <w:left w:type="dxa" w:w="100"/>
-              <w:bottom w:type="dxa" w:w="60"/>
-              <w:right w:type="dxa" w:w="100"/>
-            </w:tcMar>
-          </w:tcPr>
-          <w:p>
-            <w:pPr>
-              <w:spacing w:after="0"/>
-            </w:pPr>
-            <w:r>
-              <w:rPr>
-                <w:color w:val="14251F"/>
-                <w:sz w:val="18"/>
-                <w:szCs w:val="18"/>
-              </w:rPr>
-              <w:t xml:space="preserve">2024–2025 forecast history for training</w:t>
-            </w:r>
-          </w:p>
-        </w:tc>
-        <w:tc>
-          <w:tcPr>
-            <w:tcW w:type="dxa" w:w="3384"/>
-            <w:tcBorders>
-              <w:top w:val="single" w:color="CCD4CC" w:sz="4"/>
-              <w:left w:val="single" w:color="CCD4CC" w:sz="4"/>
-              <w:bottom w:val="single" w:color="CCD4CC" w:sz="4"/>
-              <w:right w:val="single" w:color="CCD4CC" w:sz="4"/>
-            </w:tcBorders>
-            <w:tcMar>
-              <w:top w:type="dxa" w:w="60"/>
-              <w:left w:type="dxa" w:w="100"/>
-              <w:bottom w:type="dxa" w:w="60"/>
-              <w:right w:type="dxa" w:w="100"/>
-            </w:tcMar>
-          </w:tcPr>
-          <w:p>
-            <w:pPr>
-              <w:spacing w:after="0"/>
-            </w:pPr>
-            <w:r>
-              <w:rPr>
-                <w:color w:val="14251F"/>
-                <w:sz w:val="18"/>
-                <w:szCs w:val="18"/>
-              </w:rPr>
-              <w:t xml:space="preserve">As above</w:t>
+            <w:tcW w:type="dxa" w:w="3447"/>
+            <w:tcBorders>
+              <w:top w:val="single" w:color="CCD4CC" w:sz="4"/>
+              <w:left w:val="single" w:color="CCD4CC" w:sz="4"/>
+              <w:bottom w:val="single" w:color="CCD4CC" w:sz="4"/>
+              <w:right w:val="single" w:color="CCD4CC" w:sz="4"/>
+            </w:tcBorders>
+            <w:tcMar>
+              <w:top w:type="dxa" w:w="60"/>
+              <w:left w:type="dxa" w:w="100"/>
+              <w:bottom w:type="dxa" w:w="60"/>
+              <w:right w:type="dxa" w:w="100"/>
+            </w:tcMar>
+          </w:tcPr>
+          <w:p>
+            <w:pPr>
+              <w:spacing w:after="0"/>
+            </w:pPr>
+            <w:r>
+              <w:rPr>
+                <w:color w:val="14251F"/>
+                <w:sz w:val="18"/>
+                <w:szCs w:val="18"/>
+              </w:rPr>
+              <w:t xml:space="preserve">Open-Meteo historical archive (ERA5)</w:t>
+            </w:r>
+          </w:p>
+        </w:tc>
+        <w:tc>
+          <w:tcPr>
+            <w:tcW w:type="dxa" w:w="2413"/>
+            <w:tcBorders>
+              <w:top w:val="single" w:color="CCD4CC" w:sz="4"/>
+              <w:left w:val="single" w:color="CCD4CC" w:sz="4"/>
+              <w:bottom w:val="single" w:color="CCD4CC" w:sz="4"/>
+              <w:right w:val="single" w:color="CCD4CC" w:sz="4"/>
+            </w:tcBorders>
+            <w:tcMar>
+              <w:top w:type="dxa" w:w="60"/>
+              <w:left w:type="dxa" w:w="100"/>
+              <w:bottom w:type="dxa" w:w="60"/>
+              <w:right w:type="dxa" w:w="100"/>
+            </w:tcMar>
+          </w:tcPr>
+          <w:p>
+            <w:pPr>
+              <w:spacing w:after="0"/>
+            </w:pPr>
+            <w:r>
+              <w:rPr>
+                <w:color w:val="14251F"/>
+                <w:sz w:val="18"/>
+                <w:szCs w:val="18"/>
+              </w:rPr>
+              <w:t xml:space="preserve">Historical replays, bias-correction target</w:t>
+            </w:r>
+          </w:p>
+        </w:tc>
+        <w:tc>
+          <w:tcPr>
+            <w:tcW w:type="dxa" w:w="3446"/>
+            <w:tcBorders>
+              <w:top w:val="single" w:color="CCD4CC" w:sz="4"/>
+              <w:left w:val="single" w:color="CCD4CC" w:sz="4"/>
+              <w:bottom w:val="single" w:color="CCD4CC" w:sz="4"/>
+              <w:right w:val="single" w:color="CCD4CC" w:sz="4"/>
+            </w:tcBorders>
+            <w:tcMar>
+              <w:top w:type="dxa" w:w="60"/>
+              <w:left w:type="dxa" w:w="100"/>
+              <w:bottom w:type="dxa" w:w="60"/>
+              <w:right w:type="dxa" w:w="100"/>
+            </w:tcMar>
+          </w:tcPr>
+          <w:p>
+            <w:pPr>
+              <w:spacing w:after="0"/>
+            </w:pPr>
+            <w:r>
+              <w:rPr>
+                <w:color w:val="14251F"/>
+                <w:sz w:val="18"/>
+                <w:szCs w:val="18"/>
+              </w:rPr>
+              <w:t xml:space="preserve">CC BY 4.0 (Copernicus ERA5)</w:t>
             </w:r>
           </w:p>
         </w:tc>
@@ -3603,91 +3603,91 @@
         </w:trPr>
         <w:tc>
           <w:tcPr>
-            <w:tcW w:type="dxa" w:w="2538"/>
-            <w:tcBorders>
-              <w:top w:val="single" w:color="CCD4CC" w:sz="4"/>
-              <w:left w:val="single" w:color="CCD4CC" w:sz="4"/>
-              <w:bottom w:val="single" w:color="CCD4CC" w:sz="4"/>
-              <w:right w:val="single" w:color="CCD4CC" w:sz="4"/>
-            </w:tcBorders>
-            <w:tcMar>
-              <w:top w:type="dxa" w:w="60"/>
-              <w:left w:type="dxa" w:w="100"/>
-              <w:bottom w:type="dxa" w:w="60"/>
-              <w:right w:type="dxa" w:w="100"/>
-            </w:tcMar>
-          </w:tcPr>
-          <w:p>
-            <w:pPr>
-              <w:spacing w:after="0"/>
-            </w:pPr>
-            <w:r>
-              <w:rPr>
-                <w:color w:val="14251F"/>
-                <w:sz w:val="18"/>
-                <w:szCs w:val="18"/>
-              </w:rPr>
-              <w:t xml:space="preserve">WorldPop 2020 India 1 km population</w:t>
-            </w:r>
-          </w:p>
-        </w:tc>
-        <w:tc>
-          <w:tcPr>
-            <w:tcW w:type="dxa" w:w="3384"/>
-            <w:tcBorders>
-              <w:top w:val="single" w:color="CCD4CC" w:sz="4"/>
-              <w:left w:val="single" w:color="CCD4CC" w:sz="4"/>
-              <w:bottom w:val="single" w:color="CCD4CC" w:sz="4"/>
-              <w:right w:val="single" w:color="CCD4CC" w:sz="4"/>
-            </w:tcBorders>
-            <w:tcMar>
-              <w:top w:type="dxa" w:w="60"/>
-              <w:left w:type="dxa" w:w="100"/>
-              <w:bottom w:type="dxa" w:w="60"/>
-              <w:right w:type="dxa" w:w="100"/>
-            </w:tcMar>
-          </w:tcPr>
-          <w:p>
-            <w:pPr>
-              <w:spacing w:after="0"/>
-            </w:pPr>
-            <w:r>
-              <w:rPr>
-                <w:color w:val="14251F"/>
-                <w:sz w:val="18"/>
-                <w:szCs w:val="18"/>
-              </w:rPr>
-              <w:t xml:space="preserve">Ward population exposure</w:t>
-            </w:r>
-          </w:p>
-        </w:tc>
-        <w:tc>
-          <w:tcPr>
-            <w:tcW w:type="dxa" w:w="3384"/>
-            <w:tcBorders>
-              <w:top w:val="single" w:color="CCD4CC" w:sz="4"/>
-              <w:left w:val="single" w:color="CCD4CC" w:sz="4"/>
-              <w:bottom w:val="single" w:color="CCD4CC" w:sz="4"/>
-              <w:right w:val="single" w:color="CCD4CC" w:sz="4"/>
-            </w:tcBorders>
-            <w:tcMar>
-              <w:top w:type="dxa" w:w="60"/>
-              <w:left w:type="dxa" w:w="100"/>
-              <w:bottom w:type="dxa" w:w="60"/>
-              <w:right w:type="dxa" w:w="100"/>
-            </w:tcMar>
-          </w:tcPr>
-          <w:p>
-            <w:pPr>
-              <w:spacing w:after="0"/>
-            </w:pPr>
-            <w:r>
-              <w:rPr>
-                <w:color w:val="14251F"/>
-                <w:sz w:val="18"/>
-                <w:szCs w:val="18"/>
-              </w:rPr>
-              <w:t xml:space="preserve">CC BY 4.0</w:t>
+            <w:tcW w:type="dxa" w:w="3447"/>
+            <w:tcBorders>
+              <w:top w:val="single" w:color="CCD4CC" w:sz="4"/>
+              <w:left w:val="single" w:color="CCD4CC" w:sz="4"/>
+              <w:bottom w:val="single" w:color="CCD4CC" w:sz="4"/>
+              <w:right w:val="single" w:color="CCD4CC" w:sz="4"/>
+            </w:tcBorders>
+            <w:tcMar>
+              <w:top w:type="dxa" w:w="60"/>
+              <w:left w:type="dxa" w:w="100"/>
+              <w:bottom w:type="dxa" w:w="60"/>
+              <w:right w:type="dxa" w:w="100"/>
+            </w:tcMar>
+          </w:tcPr>
+          <w:p>
+            <w:pPr>
+              <w:spacing w:after="0"/>
+            </w:pPr>
+            <w:r>
+              <w:rPr>
+                <w:color w:val="14251F"/>
+                <w:sz w:val="18"/>
+                <w:szCs w:val="18"/>
+              </w:rPr>
+              <w:t xml:space="preserve">Open-Meteo elevation API (Copernicus 90 m DEM)</w:t>
+            </w:r>
+          </w:p>
+        </w:tc>
+        <w:tc>
+          <w:tcPr>
+            <w:tcW w:type="dxa" w:w="2413"/>
+            <w:tcBorders>
+              <w:top w:val="single" w:color="CCD4CC" w:sz="4"/>
+              <w:left w:val="single" w:color="CCD4CC" w:sz="4"/>
+              <w:bottom w:val="single" w:color="CCD4CC" w:sz="4"/>
+              <w:right w:val="single" w:color="CCD4CC" w:sz="4"/>
+            </w:tcBorders>
+            <w:tcMar>
+              <w:top w:type="dxa" w:w="60"/>
+              <w:left w:type="dxa" w:w="100"/>
+              <w:bottom w:type="dxa" w:w="60"/>
+              <w:right w:type="dxa" w:w="100"/>
+            </w:tcMar>
+          </w:tcPr>
+          <w:p>
+            <w:pPr>
+              <w:spacing w:after="0"/>
+            </w:pPr>
+            <w:r>
+              <w:rPr>
+                <w:color w:val="14251F"/>
+                <w:sz w:val="18"/>
+                <w:szCs w:val="18"/>
+              </w:rPr>
+              <w:t xml:space="preserve">Terrain for the climate-zone rule</w:t>
+            </w:r>
+          </w:p>
+        </w:tc>
+        <w:tc>
+          <w:tcPr>
+            <w:tcW w:type="dxa" w:w="3446"/>
+            <w:tcBorders>
+              <w:top w:val="single" w:color="CCD4CC" w:sz="4"/>
+              <w:left w:val="single" w:color="CCD4CC" w:sz="4"/>
+              <w:bottom w:val="single" w:color="CCD4CC" w:sz="4"/>
+              <w:right w:val="single" w:color="CCD4CC" w:sz="4"/>
+            </w:tcBorders>
+            <w:tcMar>
+              <w:top w:type="dxa" w:w="60"/>
+              <w:left w:type="dxa" w:w="100"/>
+              <w:bottom w:type="dxa" w:w="60"/>
+              <w:right w:type="dxa" w:w="100"/>
+            </w:tcMar>
+          </w:tcPr>
+          <w:p>
+            <w:pPr>
+              <w:spacing w:after="0"/>
+            </w:pPr>
+            <w:r>
+              <w:rPr>
+                <w:color w:val="14251F"/>
+                <w:sz w:val="18"/>
+                <w:szCs w:val="18"/>
+              </w:rPr>
+              <w:t xml:space="preserve">Copernicus DEM licence</w:t>
             </w:r>
           </w:p>
         </w:tc>
@@ -3698,91 +3698,91 @@
         </w:trPr>
         <w:tc>
           <w:tcPr>
-            <w:tcW w:type="dxa" w:w="2538"/>
-            <w:tcBorders>
-              <w:top w:val="single" w:color="CCD4CC" w:sz="4"/>
-              <w:left w:val="single" w:color="CCD4CC" w:sz="4"/>
-              <w:bottom w:val="single" w:color="CCD4CC" w:sz="4"/>
-              <w:right w:val="single" w:color="CCD4CC" w:sz="4"/>
-            </w:tcBorders>
-            <w:tcMar>
-              <w:top w:type="dxa" w:w="60"/>
-              <w:left w:type="dxa" w:w="100"/>
-              <w:bottom w:type="dxa" w:w="60"/>
-              <w:right w:type="dxa" w:w="100"/>
-            </w:tcMar>
-          </w:tcPr>
-          <w:p>
-            <w:pPr>
-              <w:spacing w:after="0"/>
-            </w:pPr>
-            <w:r>
-              <w:rPr>
-                <w:color w:val="14251F"/>
-                <w:sz w:val="18"/>
-                <w:szCs w:val="18"/>
-              </w:rPr>
-              <w:t xml:space="preserve">DataMeet Census 2011 district boundaries</w:t>
-            </w:r>
-          </w:p>
-        </w:tc>
-        <w:tc>
-          <w:tcPr>
-            <w:tcW w:type="dxa" w:w="3384"/>
-            <w:tcBorders>
-              <w:top w:val="single" w:color="CCD4CC" w:sz="4"/>
-              <w:left w:val="single" w:color="CCD4CC" w:sz="4"/>
-              <w:bottom w:val="single" w:color="CCD4CC" w:sz="4"/>
-              <w:right w:val="single" w:color="CCD4CC" w:sz="4"/>
-            </w:tcBorders>
-            <w:tcMar>
-              <w:top w:type="dxa" w:w="60"/>
-              <w:left w:type="dxa" w:w="100"/>
-              <w:bottom w:type="dxa" w:w="60"/>
-              <w:right w:type="dxa" w:w="100"/>
-            </w:tcMar>
-          </w:tcPr>
-          <w:p>
-            <w:pPr>
-              <w:spacing w:after="0"/>
-            </w:pPr>
-            <w:r>
-              <w:rPr>
-                <w:color w:val="14251F"/>
-                <w:sz w:val="18"/>
-                <w:szCs w:val="18"/>
-              </w:rPr>
-              <w:t xml:space="preserve">District polygons</w:t>
-            </w:r>
-          </w:p>
-        </w:tc>
-        <w:tc>
-          <w:tcPr>
-            <w:tcW w:type="dxa" w:w="3384"/>
-            <w:tcBorders>
-              <w:top w:val="single" w:color="CCD4CC" w:sz="4"/>
-              <w:left w:val="single" w:color="CCD4CC" w:sz="4"/>
-              <w:bottom w:val="single" w:color="CCD4CC" w:sz="4"/>
-              <w:right w:val="single" w:color="CCD4CC" w:sz="4"/>
-            </w:tcBorders>
-            <w:tcMar>
-              <w:top w:type="dxa" w:w="60"/>
-              <w:left w:type="dxa" w:w="100"/>
-              <w:bottom w:type="dxa" w:w="60"/>
-              <w:right w:type="dxa" w:w="100"/>
-            </w:tcMar>
-          </w:tcPr>
-          <w:p>
-            <w:pPr>
-              <w:spacing w:after="0"/>
-            </w:pPr>
-            <w:r>
-              <w:rPr>
-                <w:color w:val="14251F"/>
-                <w:sz w:val="18"/>
-                <w:szCs w:val="18"/>
-              </w:rPr>
-              <w:t xml:space="preserve">CC BY 2.5 India</w:t>
+            <w:tcW w:type="dxa" w:w="3447"/>
+            <w:tcBorders>
+              <w:top w:val="single" w:color="CCD4CC" w:sz="4"/>
+              <w:left w:val="single" w:color="CCD4CC" w:sz="4"/>
+              <w:bottom w:val="single" w:color="CCD4CC" w:sz="4"/>
+              <w:right w:val="single" w:color="CCD4CC" w:sz="4"/>
+            </w:tcBorders>
+            <w:tcMar>
+              <w:top w:type="dxa" w:w="60"/>
+              <w:left w:type="dxa" w:w="100"/>
+              <w:bottom w:type="dxa" w:w="60"/>
+              <w:right w:type="dxa" w:w="100"/>
+            </w:tcMar>
+          </w:tcPr>
+          <w:p>
+            <w:pPr>
+              <w:spacing w:after="0"/>
+            </w:pPr>
+            <w:r>
+              <w:rPr>
+                <w:color w:val="14251F"/>
+                <w:sz w:val="18"/>
+                <w:szCs w:val="18"/>
+              </w:rPr>
+              <w:t xml:space="preserve">Natural Earth 10 m coastline</w:t>
+            </w:r>
+          </w:p>
+        </w:tc>
+        <w:tc>
+          <w:tcPr>
+            <w:tcW w:type="dxa" w:w="2413"/>
+            <w:tcBorders>
+              <w:top w:val="single" w:color="CCD4CC" w:sz="4"/>
+              <w:left w:val="single" w:color="CCD4CC" w:sz="4"/>
+              <w:bottom w:val="single" w:color="CCD4CC" w:sz="4"/>
+              <w:right w:val="single" w:color="CCD4CC" w:sz="4"/>
+            </w:tcBorders>
+            <w:tcMar>
+              <w:top w:type="dxa" w:w="60"/>
+              <w:left w:type="dxa" w:w="100"/>
+              <w:bottom w:type="dxa" w:w="60"/>
+              <w:right w:type="dxa" w:w="100"/>
+            </w:tcMar>
+          </w:tcPr>
+          <w:p>
+            <w:pPr>
+              <w:spacing w:after="0"/>
+            </w:pPr>
+            <w:r>
+              <w:rPr>
+                <w:color w:val="14251F"/>
+                <w:sz w:val="18"/>
+                <w:szCs w:val="18"/>
+              </w:rPr>
+              <w:t xml:space="preserve">Coastal-zone rule</w:t>
+            </w:r>
+          </w:p>
+        </w:tc>
+        <w:tc>
+          <w:tcPr>
+            <w:tcW w:type="dxa" w:w="3446"/>
+            <w:tcBorders>
+              <w:top w:val="single" w:color="CCD4CC" w:sz="4"/>
+              <w:left w:val="single" w:color="CCD4CC" w:sz="4"/>
+              <w:bottom w:val="single" w:color="CCD4CC" w:sz="4"/>
+              <w:right w:val="single" w:color="CCD4CC" w:sz="4"/>
+            </w:tcBorders>
+            <w:tcMar>
+              <w:top w:type="dxa" w:w="60"/>
+              <w:left w:type="dxa" w:w="100"/>
+              <w:bottom w:type="dxa" w:w="60"/>
+              <w:right w:type="dxa" w:w="100"/>
+            </w:tcMar>
+          </w:tcPr>
+          <w:p>
+            <w:pPr>
+              <w:spacing w:after="0"/>
+            </w:pPr>
+            <w:r>
+              <w:rPr>
+                <w:color w:val="14251F"/>
+                <w:sz w:val="18"/>
+                <w:szCs w:val="18"/>
+              </w:rPr>
+              <w:t xml:space="preserve">Public domain</w:t>
             </w:r>
           </w:p>
         </w:tc>
@@ -3793,7 +3793,292 @@
         </w:trPr>
         <w:tc>
           <w:tcPr>
-            <w:tcW w:type="dxa" w:w="2538"/>
+            <w:tcW w:type="dxa" w:w="3447"/>
+            <w:tcBorders>
+              <w:top w:val="single" w:color="CCD4CC" w:sz="4"/>
+              <w:left w:val="single" w:color="CCD4CC" w:sz="4"/>
+              <w:bottom w:val="single" w:color="CCD4CC" w:sz="4"/>
+              <w:right w:val="single" w:color="CCD4CC" w:sz="4"/>
+            </w:tcBorders>
+            <w:tcMar>
+              <w:top w:type="dxa" w:w="60"/>
+              <w:left w:type="dxa" w:w="100"/>
+              <w:bottom w:type="dxa" w:w="60"/>
+              <w:right w:type="dxa" w:w="100"/>
+            </w:tcMar>
+          </w:tcPr>
+          <w:p>
+            <w:pPr>
+              <w:spacing w:after="0"/>
+            </w:pPr>
+            <w:r>
+              <w:rPr>
+                <w:color w:val="14251F"/>
+                <w:sz w:val="18"/>
+                <w:szCs w:val="18"/>
+              </w:rPr>
+              <w:t xml:space="preserve">Open-Meteo historical forecast API (IFS)</w:t>
+            </w:r>
+          </w:p>
+        </w:tc>
+        <w:tc>
+          <w:tcPr>
+            <w:tcW w:type="dxa" w:w="2413"/>
+            <w:tcBorders>
+              <w:top w:val="single" w:color="CCD4CC" w:sz="4"/>
+              <w:left w:val="single" w:color="CCD4CC" w:sz="4"/>
+              <w:bottom w:val="single" w:color="CCD4CC" w:sz="4"/>
+              <w:right w:val="single" w:color="CCD4CC" w:sz="4"/>
+            </w:tcBorders>
+            <w:tcMar>
+              <w:top w:type="dxa" w:w="60"/>
+              <w:left w:type="dxa" w:w="100"/>
+              <w:bottom w:type="dxa" w:w="60"/>
+              <w:right w:type="dxa" w:w="100"/>
+            </w:tcMar>
+          </w:tcPr>
+          <w:p>
+            <w:pPr>
+              <w:spacing w:after="0"/>
+            </w:pPr>
+            <w:r>
+              <w:rPr>
+                <w:color w:val="14251F"/>
+                <w:sz w:val="18"/>
+                <w:szCs w:val="18"/>
+              </w:rPr>
+              <w:t xml:space="preserve">2024–2025 forecast history for training</w:t>
+            </w:r>
+          </w:p>
+        </w:tc>
+        <w:tc>
+          <w:tcPr>
+            <w:tcW w:type="dxa" w:w="3446"/>
+            <w:tcBorders>
+              <w:top w:val="single" w:color="CCD4CC" w:sz="4"/>
+              <w:left w:val="single" w:color="CCD4CC" w:sz="4"/>
+              <w:bottom w:val="single" w:color="CCD4CC" w:sz="4"/>
+              <w:right w:val="single" w:color="CCD4CC" w:sz="4"/>
+            </w:tcBorders>
+            <w:tcMar>
+              <w:top w:type="dxa" w:w="60"/>
+              <w:left w:type="dxa" w:w="100"/>
+              <w:bottom w:type="dxa" w:w="60"/>
+              <w:right w:type="dxa" w:w="100"/>
+            </w:tcMar>
+          </w:tcPr>
+          <w:p>
+            <w:pPr>
+              <w:spacing w:after="0"/>
+            </w:pPr>
+            <w:r>
+              <w:rPr>
+                <w:color w:val="14251F"/>
+                <w:sz w:val="18"/>
+                <w:szCs w:val="18"/>
+              </w:rPr>
+              <w:t xml:space="preserve">As above</w:t>
+            </w:r>
+          </w:p>
+        </w:tc>
+      </w:tr>
+      <w:tr>
+        <w:trPr>
+          <w:tblHeader w:val="off"/>
+        </w:trPr>
+        <w:tc>
+          <w:tcPr>
+            <w:tcW w:type="dxa" w:w="3447"/>
+            <w:tcBorders>
+              <w:top w:val="single" w:color="CCD4CC" w:sz="4"/>
+              <w:left w:val="single" w:color="CCD4CC" w:sz="4"/>
+              <w:bottom w:val="single" w:color="CCD4CC" w:sz="4"/>
+              <w:right w:val="single" w:color="CCD4CC" w:sz="4"/>
+            </w:tcBorders>
+            <w:tcMar>
+              <w:top w:type="dxa" w:w="60"/>
+              <w:left w:type="dxa" w:w="100"/>
+              <w:bottom w:type="dxa" w:w="60"/>
+              <w:right w:type="dxa" w:w="100"/>
+            </w:tcMar>
+          </w:tcPr>
+          <w:p>
+            <w:pPr>
+              <w:spacing w:after="0"/>
+            </w:pPr>
+            <w:r>
+              <w:rPr>
+                <w:color w:val="14251F"/>
+                <w:sz w:val="18"/>
+                <w:szCs w:val="18"/>
+              </w:rPr>
+              <w:t xml:space="preserve">WorldPop 2020 India 1 km population</w:t>
+            </w:r>
+          </w:p>
+        </w:tc>
+        <w:tc>
+          <w:tcPr>
+            <w:tcW w:type="dxa" w:w="2413"/>
+            <w:tcBorders>
+              <w:top w:val="single" w:color="CCD4CC" w:sz="4"/>
+              <w:left w:val="single" w:color="CCD4CC" w:sz="4"/>
+              <w:bottom w:val="single" w:color="CCD4CC" w:sz="4"/>
+              <w:right w:val="single" w:color="CCD4CC" w:sz="4"/>
+            </w:tcBorders>
+            <w:tcMar>
+              <w:top w:type="dxa" w:w="60"/>
+              <w:left w:type="dxa" w:w="100"/>
+              <w:bottom w:type="dxa" w:w="60"/>
+              <w:right w:type="dxa" w:w="100"/>
+            </w:tcMar>
+          </w:tcPr>
+          <w:p>
+            <w:pPr>
+              <w:spacing w:after="0"/>
+            </w:pPr>
+            <w:r>
+              <w:rPr>
+                <w:color w:val="14251F"/>
+                <w:sz w:val="18"/>
+                <w:szCs w:val="18"/>
+              </w:rPr>
+              <w:t xml:space="preserve">Ward population exposure</w:t>
+            </w:r>
+          </w:p>
+        </w:tc>
+        <w:tc>
+          <w:tcPr>
+            <w:tcW w:type="dxa" w:w="3446"/>
+            <w:tcBorders>
+              <w:top w:val="single" w:color="CCD4CC" w:sz="4"/>
+              <w:left w:val="single" w:color="CCD4CC" w:sz="4"/>
+              <w:bottom w:val="single" w:color="CCD4CC" w:sz="4"/>
+              <w:right w:val="single" w:color="CCD4CC" w:sz="4"/>
+            </w:tcBorders>
+            <w:tcMar>
+              <w:top w:type="dxa" w:w="60"/>
+              <w:left w:type="dxa" w:w="100"/>
+              <w:bottom w:type="dxa" w:w="60"/>
+              <w:right w:type="dxa" w:w="100"/>
+            </w:tcMar>
+          </w:tcPr>
+          <w:p>
+            <w:pPr>
+              <w:spacing w:after="0"/>
+            </w:pPr>
+            <w:r>
+              <w:rPr>
+                <w:color w:val="14251F"/>
+                <w:sz w:val="18"/>
+                <w:szCs w:val="18"/>
+              </w:rPr>
+              <w:t xml:space="preserve">CC BY 4.0</w:t>
+            </w:r>
+          </w:p>
+        </w:tc>
+      </w:tr>
+      <w:tr>
+        <w:trPr>
+          <w:tblHeader w:val="off"/>
+        </w:trPr>
+        <w:tc>
+          <w:tcPr>
+            <w:tcW w:type="dxa" w:w="3447"/>
+            <w:tcBorders>
+              <w:top w:val="single" w:color="CCD4CC" w:sz="4"/>
+              <w:left w:val="single" w:color="CCD4CC" w:sz="4"/>
+              <w:bottom w:val="single" w:color="CCD4CC" w:sz="4"/>
+              <w:right w:val="single" w:color="CCD4CC" w:sz="4"/>
+            </w:tcBorders>
+            <w:tcMar>
+              <w:top w:type="dxa" w:w="60"/>
+              <w:left w:type="dxa" w:w="100"/>
+              <w:bottom w:type="dxa" w:w="60"/>
+              <w:right w:type="dxa" w:w="100"/>
+            </w:tcMar>
+          </w:tcPr>
+          <w:p>
+            <w:pPr>
+              <w:spacing w:after="0"/>
+            </w:pPr>
+            <w:r>
+              <w:rPr>
+                <w:color w:val="14251F"/>
+                <w:sz w:val="18"/>
+                <w:szCs w:val="18"/>
+              </w:rPr>
+              <w:t xml:space="preserve">DataMeet Census 2011 district boundaries</w:t>
+            </w:r>
+          </w:p>
+        </w:tc>
+        <w:tc>
+          <w:tcPr>
+            <w:tcW w:type="dxa" w:w="2413"/>
+            <w:tcBorders>
+              <w:top w:val="single" w:color="CCD4CC" w:sz="4"/>
+              <w:left w:val="single" w:color="CCD4CC" w:sz="4"/>
+              <w:bottom w:val="single" w:color="CCD4CC" w:sz="4"/>
+              <w:right w:val="single" w:color="CCD4CC" w:sz="4"/>
+            </w:tcBorders>
+            <w:tcMar>
+              <w:top w:type="dxa" w:w="60"/>
+              <w:left w:type="dxa" w:w="100"/>
+              <w:bottom w:type="dxa" w:w="60"/>
+              <w:right w:type="dxa" w:w="100"/>
+            </w:tcMar>
+          </w:tcPr>
+          <w:p>
+            <w:pPr>
+              <w:spacing w:after="0"/>
+            </w:pPr>
+            <w:r>
+              <w:rPr>
+                <w:color w:val="14251F"/>
+                <w:sz w:val="18"/>
+                <w:szCs w:val="18"/>
+              </w:rPr>
+              <w:t xml:space="preserve">District polygons</w:t>
+            </w:r>
+          </w:p>
+        </w:tc>
+        <w:tc>
+          <w:tcPr>
+            <w:tcW w:type="dxa" w:w="3446"/>
+            <w:tcBorders>
+              <w:top w:val="single" w:color="CCD4CC" w:sz="4"/>
+              <w:left w:val="single" w:color="CCD4CC" w:sz="4"/>
+              <w:bottom w:val="single" w:color="CCD4CC" w:sz="4"/>
+              <w:right w:val="single" w:color="CCD4CC" w:sz="4"/>
+            </w:tcBorders>
+            <w:tcMar>
+              <w:top w:type="dxa" w:w="60"/>
+              <w:left w:type="dxa" w:w="100"/>
+              <w:bottom w:type="dxa" w:w="60"/>
+              <w:right w:type="dxa" w:w="100"/>
+            </w:tcMar>
+          </w:tcPr>
+          <w:p>
+            <w:pPr>
+              <w:spacing w:after="0"/>
+            </w:pPr>
+            <w:r>
+              <w:rPr>
+                <w:color w:val="14251F"/>
+                <w:sz w:val="18"/>
+                <w:szCs w:val="18"/>
+              </w:rPr>
+              <w:t xml:space="preserve">CC BY 2.5 India</w:t>
+            </w:r>
+          </w:p>
+        </w:tc>
+      </w:tr>
+      <w:tr>
+        <w:trPr>
+          <w:tblHeader w:val="off"/>
+        </w:trPr>
+        <w:tc>
+          <w:tcPr>
+            <w:tcW w:type="dxa" w:w="3447"/>
             <w:tcBorders>
               <w:top w:val="single" w:color="CCD4CC" w:sz="4"/>
               <w:left w:val="single" w:color="CCD4CC" w:sz="4"/>
@@ -3823,7 +4108,7 @@
         </w:tc>
         <w:tc>
           <w:tcPr>
-            <w:tcW w:type="dxa" w:w="3384"/>
+            <w:tcW w:type="dxa" w:w="2413"/>
             <w:tcBorders>
               <w:top w:val="single" w:color="CCD4CC" w:sz="4"/>
               <w:left w:val="single" w:color="CCD4CC" w:sz="4"/>
@@ -3853,7 +4138,7 @@
         </w:tc>
         <w:tc>
           <w:tcPr>
-            <w:tcW w:type="dxa" w:w="3384"/>
+            <w:tcW w:type="dxa" w:w="3446"/>
             <w:tcBorders>
               <w:top w:val="single" w:color="CCD4CC" w:sz="4"/>
               <w:left w:val="single" w:color="CCD4CC" w:sz="4"/>
@@ -3914,7 +4199,7 @@
         <w:t xml:space="preserve">config/vulnerability_source.json</w:t>
       </w:r>
       <w:r>
-        <w:t xml:space="preserve">) with commit hashes or checksums. Expensive-to-rebuild caches are committed to the repository: </w:t>
+        <w:t xml:space="preserve">) with commit hashes or checksums. Expensive-to-rebuild results are committed to the repository: </w:t>
       </w:r>
       <w:r>
         <w:rPr>
@@ -3923,10 +4208,10 @@
           <w:sz w:val="18"/>
           <w:szCs w:val="18"/>
         </w:rPr>
-        <w:t xml:space="preserve">data/raw/climatology/</w:t>
-      </w:r>
-      <w:r>
-        <w:t xml:space="preserve"> (30-year normals), </w:t>
+        <w:t xml:space="preserve">data/climatology/normals_era5.json</w:t>
+      </w:r>
+      <w:r>
+        <w:t xml:space="preserve"> (1991–2020 normals for all 641 districts), </w:t>
       </w:r>
       <w:r>
         <w:rPr>
@@ -3962,7 +4247,19 @@
         <w:t xml:space="preserve">data/models/</w:t>
       </w:r>
       <w:r>
-        <w:t xml:space="preserve">.</w:t>
+        <w:t xml:space="preserve">. The 2.7 GB of raw ERA5 hourly files are not committed; </w:t>
+      </w:r>
+      <w:r>
+        <w:rPr>
+          <w:rFonts w:ascii="Consolas" w:cs="Consolas" w:eastAsia="Consolas" w:hAnsi="Consolas"/>
+          <w:color w:val="173E32"/>
+          <w:sz w:val="18"/>
+          <w:szCs w:val="18"/>
+        </w:rPr>
+        <w:t xml:space="preserve">python -m pipeline.climatology cds</w:t>
+      </w:r>
+      <w:r>
+        <w:t xml:space="preserve"> rebuilds them with a Copernicus key.</w:t>
       </w:r>
     </w:p>
     <w:p>
@@ -3975,7 +4272,7 @@
     </w:p>
     <w:p>
       <w:r>
-        <w:t xml:space="preserve">81 districts: 63 plains, 12 hills, 6 coastal (zones used by IMD criteria).</w:t>
+        <w:t xml:space="preserve">All 641 Census 2011 districts: 465 plains, 92 coastal, 84 hills (the zone decides which IMD criteria apply).</w:t>
       </w:r>
     </w:p>
     <w:tbl>
@@ -3991,8 +4288,8 @@
         </w:tblBorders>
       </w:tblPr>
       <w:tblGrid>
-        <w:gridCol w:w="8092"/>
-        <w:gridCol w:w="1214"/>
+        <w:gridCol w:w="6069"/>
+        <w:gridCol w:w="3237"/>
       </w:tblGrid>
       <w:tr>
         <w:trPr>
@@ -4000,7 +4297,7 @@
         </w:trPr>
         <w:tc>
           <w:tcPr>
-            <w:tcW w:type="dxa" w:w="8092"/>
+            <w:tcW w:type="dxa" w:w="6069"/>
             <w:tcBorders>
               <w:top w:val="single" w:color="CCD4CC" w:sz="4"/>
               <w:left w:val="single" w:color="CCD4CC" w:sz="4"/>
@@ -4027,13 +4324,13 @@
                 <w:sz w:val="18"/>
                 <w:szCs w:val="18"/>
               </w:rPr>
-              <w:t xml:space="preserve">State / UT</w:t>
-            </w:r>
-          </w:p>
-        </w:tc>
-        <w:tc>
-          <w:tcPr>
-            <w:tcW w:type="dxa" w:w="1214"/>
+              <w:t xml:space="preserve">How it was set</w:t>
+            </w:r>
+          </w:p>
+        </w:tc>
+        <w:tc>
+          <w:tcPr>
+            <w:tcW w:type="dxa" w:w="3237"/>
             <w:tcBorders>
               <w:top w:val="single" w:color="CCD4CC" w:sz="4"/>
               <w:left w:val="single" w:color="CCD4CC" w:sz="4"/>
@@ -4071,61 +4368,61 @@
         </w:trPr>
         <w:tc>
           <w:tcPr>
-            <w:tcW w:type="dxa" w:w="8092"/>
-            <w:tcBorders>
-              <w:top w:val="single" w:color="CCD4CC" w:sz="4"/>
-              <w:left w:val="single" w:color="CCD4CC" w:sz="4"/>
-              <w:bottom w:val="single" w:color="CCD4CC" w:sz="4"/>
-              <w:right w:val="single" w:color="CCD4CC" w:sz="4"/>
-            </w:tcBorders>
-            <w:tcMar>
-              <w:top w:type="dxa" w:w="60"/>
-              <w:left w:type="dxa" w:w="100"/>
-              <w:bottom w:type="dxa" w:w="60"/>
-              <w:right w:type="dxa" w:w="100"/>
-            </w:tcMar>
-          </w:tcPr>
-          <w:p>
-            <w:pPr>
-              <w:spacing w:after="0"/>
-            </w:pPr>
-            <w:r>
-              <w:rPr>
-                <w:color w:val="14251F"/>
-                <w:sz w:val="18"/>
-                <w:szCs w:val="18"/>
-              </w:rPr>
-              <w:t xml:space="preserve">Uttar Pradesh</w:t>
-            </w:r>
-          </w:p>
-        </w:tc>
-        <w:tc>
-          <w:tcPr>
-            <w:tcW w:type="dxa" w:w="1214"/>
-            <w:tcBorders>
-              <w:top w:val="single" w:color="CCD4CC" w:sz="4"/>
-              <w:left w:val="single" w:color="CCD4CC" w:sz="4"/>
-              <w:bottom w:val="single" w:color="CCD4CC" w:sz="4"/>
-              <w:right w:val="single" w:color="CCD4CC" w:sz="4"/>
-            </w:tcBorders>
-            <w:tcMar>
-              <w:top w:type="dxa" w:w="60"/>
-              <w:left w:type="dxa" w:w="100"/>
-              <w:bottom w:type="dxa" w:w="60"/>
-              <w:right w:type="dxa" w:w="100"/>
-            </w:tcMar>
-          </w:tcPr>
-          <w:p>
-            <w:pPr>
-              <w:spacing w:after="0"/>
-            </w:pPr>
-            <w:r>
-              <w:rPr>
-                <w:color w:val="14251F"/>
-                <w:sz w:val="18"/>
-                <w:szCs w:val="18"/>
-              </w:rPr>
-              <w:t xml:space="preserve">10</w:t>
+            <w:tcW w:type="dxa" w:w="6069"/>
+            <w:tcBorders>
+              <w:top w:val="single" w:color="CCD4CC" w:sz="4"/>
+              <w:left w:val="single" w:color="CCD4CC" w:sz="4"/>
+              <w:bottom w:val="single" w:color="CCD4CC" w:sz="4"/>
+              <w:right w:val="single" w:color="CCD4CC" w:sz="4"/>
+            </w:tcBorders>
+            <w:tcMar>
+              <w:top w:type="dxa" w:w="60"/>
+              <w:left w:type="dxa" w:w="100"/>
+              <w:bottom w:type="dxa" w:w="60"/>
+              <w:right w:type="dxa" w:w="100"/>
+            </w:tcMar>
+          </w:tcPr>
+          <w:p>
+            <w:pPr>
+              <w:spacing w:after="0"/>
+            </w:pPr>
+            <w:r>
+              <w:rPr>
+                <w:color w:val="14251F"/>
+                <w:sz w:val="18"/>
+                <w:szCs w:val="18"/>
+              </w:rPr>
+              <w:t xml:space="preserve">Hand-chosen forecast point (city) and zone</w:t>
+            </w:r>
+          </w:p>
+        </w:tc>
+        <w:tc>
+          <w:tcPr>
+            <w:tcW w:type="dxa" w:w="3237"/>
+            <w:tcBorders>
+              <w:top w:val="single" w:color="CCD4CC" w:sz="4"/>
+              <w:left w:val="single" w:color="CCD4CC" w:sz="4"/>
+              <w:bottom w:val="single" w:color="CCD4CC" w:sz="4"/>
+              <w:right w:val="single" w:color="CCD4CC" w:sz="4"/>
+            </w:tcBorders>
+            <w:tcMar>
+              <w:top w:type="dxa" w:w="60"/>
+              <w:left w:type="dxa" w:w="100"/>
+              <w:bottom w:type="dxa" w:w="60"/>
+              <w:right w:type="dxa" w:w="100"/>
+            </w:tcMar>
+          </w:tcPr>
+          <w:p>
+            <w:pPr>
+              <w:spacing w:after="0"/>
+            </w:pPr>
+            <w:r>
+              <w:rPr>
+                <w:color w:val="14251F"/>
+                <w:sz w:val="18"/>
+                <w:szCs w:val="18"/>
+              </w:rPr>
+              <w:t xml:space="preserve">81 heat-prone and demo districts</w:t>
             </w:r>
           </w:p>
         </w:tc>
@@ -4136,386 +4433,61 @@
         </w:trPr>
         <w:tc>
           <w:tcPr>
-            <w:tcW w:type="dxa" w:w="8092"/>
-            <w:tcBorders>
-              <w:top w:val="single" w:color="CCD4CC" w:sz="4"/>
-              <w:left w:val="single" w:color="CCD4CC" w:sz="4"/>
-              <w:bottom w:val="single" w:color="CCD4CC" w:sz="4"/>
-              <w:right w:val="single" w:color="CCD4CC" w:sz="4"/>
-            </w:tcBorders>
-            <w:tcMar>
-              <w:top w:type="dxa" w:w="60"/>
-              <w:left w:type="dxa" w:w="100"/>
-              <w:bottom w:type="dxa" w:w="60"/>
-              <w:right w:type="dxa" w:w="100"/>
-            </w:tcMar>
-          </w:tcPr>
-          <w:p>
-            <w:pPr>
-              <w:spacing w:after="0"/>
-            </w:pPr>
-            <w:r>
-              <w:rPr>
-                <w:color w:val="14251F"/>
-                <w:sz w:val="18"/>
-                <w:szCs w:val="18"/>
-              </w:rPr>
-              <w:t xml:space="preserve">Madhya Pradesh, Maharashtra</w:t>
-            </w:r>
-          </w:p>
-        </w:tc>
-        <w:tc>
-          <w:tcPr>
-            <w:tcW w:type="dxa" w:w="1214"/>
-            <w:tcBorders>
-              <w:top w:val="single" w:color="CCD4CC" w:sz="4"/>
-              <w:left w:val="single" w:color="CCD4CC" w:sz="4"/>
-              <w:bottom w:val="single" w:color="CCD4CC" w:sz="4"/>
-              <w:right w:val="single" w:color="CCD4CC" w:sz="4"/>
-            </w:tcBorders>
-            <w:tcMar>
-              <w:top w:type="dxa" w:w="60"/>
-              <w:left w:type="dxa" w:w="100"/>
-              <w:bottom w:type="dxa" w:w="60"/>
-              <w:right w:type="dxa" w:w="100"/>
-            </w:tcMar>
-          </w:tcPr>
-          <w:p>
-            <w:pPr>
-              <w:spacing w:after="0"/>
-            </w:pPr>
-            <w:r>
-              <w:rPr>
-                <w:color w:val="14251F"/>
-                <w:sz w:val="18"/>
-                <w:szCs w:val="18"/>
-              </w:rPr>
-              <w:t xml:space="preserve">7 each</w:t>
-            </w:r>
-          </w:p>
-        </w:tc>
-      </w:tr>
-      <w:tr>
-        <w:trPr>
-          <w:tblHeader w:val="off"/>
-        </w:trPr>
-        <w:tc>
-          <w:tcPr>
-            <w:tcW w:type="dxa" w:w="8092"/>
-            <w:tcBorders>
-              <w:top w:val="single" w:color="CCD4CC" w:sz="4"/>
-              <w:left w:val="single" w:color="CCD4CC" w:sz="4"/>
-              <w:bottom w:val="single" w:color="CCD4CC" w:sz="4"/>
-              <w:right w:val="single" w:color="CCD4CC" w:sz="4"/>
-            </w:tcBorders>
-            <w:tcMar>
-              <w:top w:type="dxa" w:w="60"/>
-              <w:left w:type="dxa" w:w="100"/>
-              <w:bottom w:type="dxa" w:w="60"/>
-              <w:right w:type="dxa" w:w="100"/>
-            </w:tcMar>
-          </w:tcPr>
-          <w:p>
-            <w:pPr>
-              <w:spacing w:after="0"/>
-            </w:pPr>
-            <w:r>
-              <w:rPr>
-                <w:color w:val="14251F"/>
-                <w:sz w:val="18"/>
-                <w:szCs w:val="18"/>
-              </w:rPr>
-              <w:t xml:space="preserve">Delhi, Tamil Nadu</w:t>
-            </w:r>
-          </w:p>
-        </w:tc>
-        <w:tc>
-          <w:tcPr>
-            <w:tcW w:type="dxa" w:w="1214"/>
-            <w:tcBorders>
-              <w:top w:val="single" w:color="CCD4CC" w:sz="4"/>
-              <w:left w:val="single" w:color="CCD4CC" w:sz="4"/>
-              <w:bottom w:val="single" w:color="CCD4CC" w:sz="4"/>
-              <w:right w:val="single" w:color="CCD4CC" w:sz="4"/>
-            </w:tcBorders>
-            <w:tcMar>
-              <w:top w:type="dxa" w:w="60"/>
-              <w:left w:type="dxa" w:w="100"/>
-              <w:bottom w:type="dxa" w:w="60"/>
-              <w:right w:type="dxa" w:w="100"/>
-            </w:tcMar>
-          </w:tcPr>
-          <w:p>
-            <w:pPr>
-              <w:spacing w:after="0"/>
-            </w:pPr>
-            <w:r>
-              <w:rPr>
-                <w:color w:val="14251F"/>
-                <w:sz w:val="18"/>
-                <w:szCs w:val="18"/>
-              </w:rPr>
-              <w:t xml:space="preserve">6 each</w:t>
-            </w:r>
-          </w:p>
-        </w:tc>
-      </w:tr>
-      <w:tr>
-        <w:trPr>
-          <w:tblHeader w:val="off"/>
-        </w:trPr>
-        <w:tc>
-          <w:tcPr>
-            <w:tcW w:type="dxa" w:w="8092"/>
-            <w:tcBorders>
-              <w:top w:val="single" w:color="CCD4CC" w:sz="4"/>
-              <w:left w:val="single" w:color="CCD4CC" w:sz="4"/>
-              <w:bottom w:val="single" w:color="CCD4CC" w:sz="4"/>
-              <w:right w:val="single" w:color="CCD4CC" w:sz="4"/>
-            </w:tcBorders>
-            <w:tcMar>
-              <w:top w:type="dxa" w:w="60"/>
-              <w:left w:type="dxa" w:w="100"/>
-              <w:bottom w:type="dxa" w:w="60"/>
-              <w:right w:type="dxa" w:w="100"/>
-            </w:tcMar>
-          </w:tcPr>
-          <w:p>
-            <w:pPr>
-              <w:spacing w:after="0"/>
-            </w:pPr>
-            <w:r>
-              <w:rPr>
-                <w:color w:val="14251F"/>
-                <w:sz w:val="18"/>
-                <w:szCs w:val="18"/>
-              </w:rPr>
-              <w:t xml:space="preserve">Arunachal Pradesh, Assam, Jammu and Kashmir, Jharkhand, Punjab, Rajasthan</w:t>
-            </w:r>
-          </w:p>
-        </w:tc>
-        <w:tc>
-          <w:tcPr>
-            <w:tcW w:type="dxa" w:w="1214"/>
-            <w:tcBorders>
-              <w:top w:val="single" w:color="CCD4CC" w:sz="4"/>
-              <w:left w:val="single" w:color="CCD4CC" w:sz="4"/>
-              <w:bottom w:val="single" w:color="CCD4CC" w:sz="4"/>
-              <w:right w:val="single" w:color="CCD4CC" w:sz="4"/>
-            </w:tcBorders>
-            <w:tcMar>
-              <w:top w:type="dxa" w:w="60"/>
-              <w:left w:type="dxa" w:w="100"/>
-              <w:bottom w:type="dxa" w:w="60"/>
-              <w:right w:type="dxa" w:w="100"/>
-            </w:tcMar>
-          </w:tcPr>
-          <w:p>
-            <w:pPr>
-              <w:spacing w:after="0"/>
-            </w:pPr>
-            <w:r>
-              <w:rPr>
-                <w:color w:val="14251F"/>
-                <w:sz w:val="18"/>
-                <w:szCs w:val="18"/>
-              </w:rPr>
-              <w:t xml:space="preserve">5 each</w:t>
-            </w:r>
-          </w:p>
-        </w:tc>
-      </w:tr>
-      <w:tr>
-        <w:trPr>
-          <w:tblHeader w:val="off"/>
-        </w:trPr>
-        <w:tc>
-          <w:tcPr>
-            <w:tcW w:type="dxa" w:w="8092"/>
-            <w:tcBorders>
-              <w:top w:val="single" w:color="CCD4CC" w:sz="4"/>
-              <w:left w:val="single" w:color="CCD4CC" w:sz="4"/>
-              <w:bottom w:val="single" w:color="CCD4CC" w:sz="4"/>
-              <w:right w:val="single" w:color="CCD4CC" w:sz="4"/>
-            </w:tcBorders>
-            <w:tcMar>
-              <w:top w:type="dxa" w:w="60"/>
-              <w:left w:type="dxa" w:w="100"/>
-              <w:bottom w:type="dxa" w:w="60"/>
-              <w:right w:type="dxa" w:w="100"/>
-            </w:tcMar>
-          </w:tcPr>
-          <w:p>
-            <w:pPr>
-              <w:spacing w:after="0"/>
-            </w:pPr>
-            <w:r>
-              <w:rPr>
-                <w:color w:val="14251F"/>
-                <w:sz w:val="18"/>
-                <w:szCs w:val="18"/>
-              </w:rPr>
-              <w:t xml:space="preserve">Andhra Pradesh</w:t>
-            </w:r>
-          </w:p>
-        </w:tc>
-        <w:tc>
-          <w:tcPr>
-            <w:tcW w:type="dxa" w:w="1214"/>
-            <w:tcBorders>
-              <w:top w:val="single" w:color="CCD4CC" w:sz="4"/>
-              <w:left w:val="single" w:color="CCD4CC" w:sz="4"/>
-              <w:bottom w:val="single" w:color="CCD4CC" w:sz="4"/>
-              <w:right w:val="single" w:color="CCD4CC" w:sz="4"/>
-            </w:tcBorders>
-            <w:tcMar>
-              <w:top w:type="dxa" w:w="60"/>
-              <w:left w:type="dxa" w:w="100"/>
-              <w:bottom w:type="dxa" w:w="60"/>
-              <w:right w:type="dxa" w:w="100"/>
-            </w:tcMar>
-          </w:tcPr>
-          <w:p>
-            <w:pPr>
-              <w:spacing w:after="0"/>
-            </w:pPr>
-            <w:r>
-              <w:rPr>
-                <w:color w:val="14251F"/>
-                <w:sz w:val="18"/>
-                <w:szCs w:val="18"/>
-              </w:rPr>
-              <w:t xml:space="preserve">4</w:t>
-            </w:r>
-          </w:p>
-        </w:tc>
-      </w:tr>
-      <w:tr>
-        <w:trPr>
-          <w:tblHeader w:val="off"/>
-        </w:trPr>
-        <w:tc>
-          <w:tcPr>
-            <w:tcW w:type="dxa" w:w="8092"/>
-            <w:tcBorders>
-              <w:top w:val="single" w:color="CCD4CC" w:sz="4"/>
-              <w:left w:val="single" w:color="CCD4CC" w:sz="4"/>
-              <w:bottom w:val="single" w:color="CCD4CC" w:sz="4"/>
-              <w:right w:val="single" w:color="CCD4CC" w:sz="4"/>
-            </w:tcBorders>
-            <w:tcMar>
-              <w:top w:type="dxa" w:w="60"/>
-              <w:left w:type="dxa" w:w="100"/>
-              <w:bottom w:type="dxa" w:w="60"/>
-              <w:right w:type="dxa" w:w="100"/>
-            </w:tcMar>
-          </w:tcPr>
-          <w:p>
-            <w:pPr>
-              <w:spacing w:after="0"/>
-            </w:pPr>
-            <w:r>
-              <w:rPr>
-                <w:color w:val="14251F"/>
-                <w:sz w:val="18"/>
-                <w:szCs w:val="18"/>
-              </w:rPr>
-              <w:t xml:space="preserve">Bihar, Gujarat, Ladakh, Odisha</w:t>
-            </w:r>
-          </w:p>
-        </w:tc>
-        <w:tc>
-          <w:tcPr>
-            <w:tcW w:type="dxa" w:w="1214"/>
-            <w:tcBorders>
-              <w:top w:val="single" w:color="CCD4CC" w:sz="4"/>
-              <w:left w:val="single" w:color="CCD4CC" w:sz="4"/>
-              <w:bottom w:val="single" w:color="CCD4CC" w:sz="4"/>
-              <w:right w:val="single" w:color="CCD4CC" w:sz="4"/>
-            </w:tcBorders>
-            <w:tcMar>
-              <w:top w:type="dxa" w:w="60"/>
-              <w:left w:type="dxa" w:w="100"/>
-              <w:bottom w:type="dxa" w:w="60"/>
-              <w:right w:type="dxa" w:w="100"/>
-            </w:tcMar>
-          </w:tcPr>
-          <w:p>
-            <w:pPr>
-              <w:spacing w:after="0"/>
-            </w:pPr>
-            <w:r>
-              <w:rPr>
-                <w:color w:val="14251F"/>
-                <w:sz w:val="18"/>
-                <w:szCs w:val="18"/>
-              </w:rPr>
-              <w:t xml:space="preserve">2 each</w:t>
-            </w:r>
-          </w:p>
-        </w:tc>
-      </w:tr>
-      <w:tr>
-        <w:trPr>
-          <w:tblHeader w:val="off"/>
-        </w:trPr>
-        <w:tc>
-          <w:tcPr>
-            <w:tcW w:type="dxa" w:w="8092"/>
-            <w:tcBorders>
-              <w:top w:val="single" w:color="CCD4CC" w:sz="4"/>
-              <w:left w:val="single" w:color="CCD4CC" w:sz="4"/>
-              <w:bottom w:val="single" w:color="CCD4CC" w:sz="4"/>
-              <w:right w:val="single" w:color="CCD4CC" w:sz="4"/>
-            </w:tcBorders>
-            <w:tcMar>
-              <w:top w:type="dxa" w:w="60"/>
-              <w:left w:type="dxa" w:w="100"/>
-              <w:bottom w:type="dxa" w:w="60"/>
-              <w:right w:type="dxa" w:w="100"/>
-            </w:tcMar>
-          </w:tcPr>
-          <w:p>
-            <w:pPr>
-              <w:spacing w:after="0"/>
-            </w:pPr>
-            <w:r>
-              <w:rPr>
-                <w:color w:val="14251F"/>
-                <w:sz w:val="18"/>
-                <w:szCs w:val="18"/>
-              </w:rPr>
-              <w:t xml:space="preserve">Himachal Pradesh, Telangana, West Bengal</w:t>
-            </w:r>
-          </w:p>
-        </w:tc>
-        <w:tc>
-          <w:tcPr>
-            <w:tcW w:type="dxa" w:w="1214"/>
-            <w:tcBorders>
-              <w:top w:val="single" w:color="CCD4CC" w:sz="4"/>
-              <w:left w:val="single" w:color="CCD4CC" w:sz="4"/>
-              <w:bottom w:val="single" w:color="CCD4CC" w:sz="4"/>
-              <w:right w:val="single" w:color="CCD4CC" w:sz="4"/>
-            </w:tcBorders>
-            <w:tcMar>
-              <w:top w:type="dxa" w:w="60"/>
-              <w:left w:type="dxa" w:w="100"/>
-              <w:bottom w:type="dxa" w:w="60"/>
-              <w:right w:type="dxa" w:w="100"/>
-            </w:tcMar>
-          </w:tcPr>
-          <w:p>
-            <w:pPr>
-              <w:spacing w:after="0"/>
-            </w:pPr>
-            <w:r>
-              <w:rPr>
-                <w:color w:val="14251F"/>
-                <w:sz w:val="18"/>
-                <w:szCs w:val="18"/>
-              </w:rPr>
-              <w:t xml:space="preserve">1 each</w:t>
+            <w:tcW w:type="dxa" w:w="6069"/>
+            <w:tcBorders>
+              <w:top w:val="single" w:color="CCD4CC" w:sz="4"/>
+              <w:left w:val="single" w:color="CCD4CC" w:sz="4"/>
+              <w:bottom w:val="single" w:color="CCD4CC" w:sz="4"/>
+              <w:right w:val="single" w:color="CCD4CC" w:sz="4"/>
+            </w:tcBorders>
+            <w:tcMar>
+              <w:top w:type="dxa" w:w="60"/>
+              <w:left w:type="dxa" w:w="100"/>
+              <w:bottom w:type="dxa" w:w="60"/>
+              <w:right w:type="dxa" w:w="100"/>
+            </w:tcMar>
+          </w:tcPr>
+          <w:p>
+            <w:pPr>
+              <w:spacing w:after="0"/>
+            </w:pPr>
+            <w:r>
+              <w:rPr>
+                <w:color w:val="14251F"/>
+                <w:sz w:val="18"/>
+                <w:szCs w:val="18"/>
+              </w:rPr>
+              <w:t xml:space="preserve">Automatic forecast point (guaranteed inside the district) and rule-based zone</w:t>
+            </w:r>
+          </w:p>
+        </w:tc>
+        <w:tc>
+          <w:tcPr>
+            <w:tcW w:type="dxa" w:w="3237"/>
+            <w:tcBorders>
+              <w:top w:val="single" w:color="CCD4CC" w:sz="4"/>
+              <w:left w:val="single" w:color="CCD4CC" w:sz="4"/>
+              <w:bottom w:val="single" w:color="CCD4CC" w:sz="4"/>
+              <w:right w:val="single" w:color="CCD4CC" w:sz="4"/>
+            </w:tcBorders>
+            <w:tcMar>
+              <w:top w:type="dxa" w:w="60"/>
+              <w:left w:type="dxa" w:w="100"/>
+              <w:bottom w:type="dxa" w:w="60"/>
+              <w:right w:type="dxa" w:w="100"/>
+            </w:tcMar>
+          </w:tcPr>
+          <w:p>
+            <w:pPr>
+              <w:spacing w:after="0"/>
+            </w:pPr>
+            <w:r>
+              <w:rPr>
+                <w:color w:val="14251F"/>
+                <w:sz w:val="18"/>
+                <w:szCs w:val="18"/>
+              </w:rPr>
+              <w:t xml:space="preserve">560</w:t>
             </w:r>
           </w:p>
         </w:tc>
@@ -4525,6 +4497,53 @@
       <w:pPr>
         <w:spacing w:after="120"/>
       </w:pPr>
+    </w:p>
+    <w:p>
+      <w:r>
+        <w:t xml:space="preserve">The zone rule (</w:t>
+      </w:r>
+      <w:r>
+        <w:rPr>
+          <w:rFonts w:ascii="Consolas" w:cs="Consolas" w:eastAsia="Consolas" w:hAnsi="Consolas"/>
+          <w:color w:val="173E32"/>
+          <w:sz w:val="18"/>
+          <w:szCs w:val="18"/>
+        </w:rPr>
+        <w:t xml:space="preserve">scripts/build_all_districts.py</w:t>
+      </w:r>
+      <w:r>
+        <w:t xml:space="preserve">): </w:t>
+      </w:r>
+      <w:r>
+        <w:rPr>
+          <w:b/>
+          <w:bCs/>
+        </w:rPr>
+        <w:t xml:space="preserve">hills</w:t>
+      </w:r>
+      <w:r>
+        <w:t xml:space="preserve"> if the median of 7 sampled elevations is at least 1000 m, or at least 400 m with 800 m of relief (this separates hill districts like Idukki from flat plateaus like Bengaluru); </w:t>
+      </w:r>
+      <w:r>
+        <w:rPr>
+          <w:b/>
+          <w:bCs/>
+        </w:rPr>
+        <w:t xml:space="preserve">coastal</w:t>
+      </w:r>
+      <w:r>
+        <w:t xml:space="preserve"> if the district is within 25 km of the coastline; otherwise </w:t>
+      </w:r>
+      <w:r>
+        <w:rPr>
+          <w:b/>
+          <w:bCs/>
+        </w:rPr>
+        <w:t xml:space="preserve">plains</w:t>
+      </w:r>
+      <w:r>
+        <w:t xml:space="preserve">.</w:t>
+      </w:r>
     </w:p>
     <w:p>
       <w:pPr>
@@ -5333,7 +5352,7 @@
           <w:sz w:val="18"/>
           <w:szCs w:val="18"/>
         </w:rPr>
-        <w:t xml:space="preserve">imd-track1-2026-09-28</w:t>
+        <w:t xml:space="preserve">heatwatch-rules-2026-10-01</w:t>
       </w:r>
       <w:r>
         <w:t xml:space="preserve">), taken from IMD's heat-wave criteria.</w:t>
@@ -5759,7 +5778,7 @@
     </w:p>
     <w:p>
       <w:r>
-        <w:t xml:space="preserve">The normal for a day is the mean ERA5 Tmax within ±7 days across 1991–2020. Persistence looks ahead through the forecast (early warning); a hot day also keeps the hot spell it belongs to, so the last days of a spell are not reset to green.</w:t>
+        <w:t xml:space="preserve">The normal for a day is the mean daily Tmax within ±7 days across 1991–2020. Daily Tmax and Tmin come from hourly ERA5 at the hottest and coolest hours of the IST day (the same definition the forecast uses), interpolated to the forecast point and adjusted to its elevation with the standard 6.5 °C/km lapse rate. Persistence looks ahead through the forecast (early warning); a hot day also keeps the hot spell it belongs to, so the last days of a spell are not reset to green.</w:t>
       </w:r>
     </w:p>
     <w:p>
@@ -5982,7 +6001,7 @@
                 <w:sz w:val="18"/>
                 <w:szCs w:val="18"/>
               </w:rPr>
-              <w:t xml:space="preserve">Consecutive days with Tmin ≥ the 1991–2020 90th-percentile Tmin: 2 → yellow, 3 → orange</w:t>
+              <w:t xml:space="preserve">Consecutive days with Tmin ≥ both the 1991–2020 90th-percentile Tmin and 25 °C: 2 → yellow, 3 → orange</w:t>
             </w:r>
           </w:p>
         </w:tc>
@@ -6289,7 +6308,7 @@
                 <w:sz w:val="18"/>
                 <w:szCs w:val="18"/>
               </w:rPr>
-              <w:t xml:space="preserve">37.9 °C, +1.2 °C above the 1991–2020 normal</w:t>
+              <w:t xml:space="preserve">37.9 °C, +1.4 °C above the 1991–2020 normal</w:t>
             </w:r>
           </w:p>
         </w:tc>
@@ -8034,7 +8053,7 @@
     </w:p>
     <w:p>
       <w:r>
-        <w:t xml:space="preserve">Trained on 56,538 forecast/ERA5 day pairs from all 81 districts.</w:t>
+        <w:t xml:space="preserve">Trained on 56,538 forecast/ERA5 day pairs from the 81 districts covered when it was trained; the per-zone models apply to all 641 districts.</w:t>
       </w:r>
     </w:p>
     <w:p>
@@ -9280,10 +9299,10 @@
         </w:tblBorders>
       </w:tblPr>
       <w:tblGrid>
-        <w:gridCol w:w="2961"/>
-        <w:gridCol w:w="1607"/>
-        <w:gridCol w:w="2453"/>
-        <w:gridCol w:w="2285"/>
+        <w:gridCol w:w="3044"/>
+        <w:gridCol w:w="1652"/>
+        <w:gridCol w:w="2609"/>
+        <w:gridCol w:w="2001"/>
       </w:tblGrid>
       <w:tr>
         <w:trPr>
@@ -9291,7 +9310,7 @@
         </w:trPr>
         <w:tc>
           <w:tcPr>
-            <w:tcW w:type="dxa" w:w="2961"/>
+            <w:tcW w:type="dxa" w:w="3044"/>
             <w:tcBorders>
               <w:top w:val="single" w:color="CCD4CC" w:sz="4"/>
               <w:left w:val="single" w:color="CCD4CC" w:sz="4"/>
@@ -9324,7 +9343,7 @@
         </w:tc>
         <w:tc>
           <w:tcPr>
-            <w:tcW w:type="dxa" w:w="1607"/>
+            <w:tcW w:type="dxa" w:w="1652"/>
             <w:tcBorders>
               <w:top w:val="single" w:color="CCD4CC" w:sz="4"/>
               <w:left w:val="single" w:color="CCD4CC" w:sz="4"/>
@@ -9357,7 +9376,7 @@
         </w:tc>
         <w:tc>
           <w:tcPr>
-            <w:tcW w:type="dxa" w:w="2453"/>
+            <w:tcW w:type="dxa" w:w="2609"/>
             <w:tcBorders>
               <w:top w:val="single" w:color="CCD4CC" w:sz="4"/>
               <w:left w:val="single" w:color="CCD4CC" w:sz="4"/>
@@ -9384,13 +9403,13 @@
                 <w:sz w:val="18"/>
                 <w:szCs w:val="18"/>
               </w:rPr>
-              <w:t xml:space="preserve">Red districts per day (of 81)</w:t>
-            </w:r>
-          </w:p>
-        </w:tc>
-        <w:tc>
-          <w:tcPr>
-            <w:tcW w:type="dxa" w:w="2285"/>
+              <w:t xml:space="preserve">Red districts per day (of 641)</w:t>
+            </w:r>
+          </w:p>
+        </w:tc>
+        <w:tc>
+          <w:tcPr>
+            <w:tcW w:type="dxa" w:w="2001"/>
             <w:tcBorders>
               <w:top w:val="single" w:color="CCD4CC" w:sz="4"/>
               <w:left w:val="single" w:color="CCD4CC" w:sz="4"/>
@@ -9428,7 +9447,7 @@
         </w:trPr>
         <w:tc>
           <w:tcPr>
-            <w:tcW w:type="dxa" w:w="2961"/>
+            <w:tcW w:type="dxa" w:w="3044"/>
             <w:tcBorders>
               <w:top w:val="single" w:color="CCD4CC" w:sz="4"/>
               <w:left w:val="single" w:color="CCD4CC" w:sz="4"/>
@@ -9458,7 +9477,7 @@
         </w:tc>
         <w:tc>
           <w:tcPr>
-            <w:tcW w:type="dxa" w:w="1607"/>
+            <w:tcW w:type="dxa" w:w="1652"/>
             <w:tcBorders>
               <w:top w:val="single" w:color="CCD4CC" w:sz="4"/>
               <w:left w:val="single" w:color="CCD4CC" w:sz="4"/>
@@ -9488,37 +9507,37 @@
         </w:tc>
         <w:tc>
           <w:tcPr>
-            <w:tcW w:type="dxa" w:w="2453"/>
-            <w:tcBorders>
-              <w:top w:val="single" w:color="CCD4CC" w:sz="4"/>
-              <w:left w:val="single" w:color="CCD4CC" w:sz="4"/>
-              <w:bottom w:val="single" w:color="CCD4CC" w:sz="4"/>
-              <w:right w:val="single" w:color="CCD4CC" w:sz="4"/>
-            </w:tcBorders>
-            <w:tcMar>
-              <w:top w:type="dxa" w:w="60"/>
-              <w:left w:type="dxa" w:w="100"/>
-              <w:bottom w:type="dxa" w:w="60"/>
-              <w:right w:type="dxa" w:w="100"/>
-            </w:tcMar>
-          </w:tcPr>
-          <w:p>
-            <w:pPr>
-              <w:spacing w:after="0"/>
-            </w:pPr>
-            <w:r>
-              <w:rPr>
-                <w:color w:val="14251F"/>
-                <w:sz w:val="18"/>
-                <w:szCs w:val="18"/>
-              </w:rPr>
-              <w:t xml:space="preserve">20, 20, 21, 19, 14, 16, 8</w:t>
-            </w:r>
-          </w:p>
-        </w:tc>
-        <w:tc>
-          <w:tcPr>
-            <w:tcW w:type="dxa" w:w="2285"/>
+            <w:tcW w:type="dxa" w:w="2609"/>
+            <w:tcBorders>
+              <w:top w:val="single" w:color="CCD4CC" w:sz="4"/>
+              <w:left w:val="single" w:color="CCD4CC" w:sz="4"/>
+              <w:bottom w:val="single" w:color="CCD4CC" w:sz="4"/>
+              <w:right w:val="single" w:color="CCD4CC" w:sz="4"/>
+            </w:tcBorders>
+            <w:tcMar>
+              <w:top w:type="dxa" w:w="60"/>
+              <w:left w:type="dxa" w:w="100"/>
+              <w:bottom w:type="dxa" w:w="60"/>
+              <w:right w:type="dxa" w:w="100"/>
+            </w:tcMar>
+          </w:tcPr>
+          <w:p>
+            <w:pPr>
+              <w:spacing w:after="0"/>
+            </w:pPr>
+            <w:r>
+              <w:rPr>
+                <w:color w:val="14251F"/>
+                <w:sz w:val="18"/>
+                <w:szCs w:val="18"/>
+              </w:rPr>
+              <w:t xml:space="preserve">96, 105, 126, 107, 78, 69, 45</w:t>
+            </w:r>
+          </w:p>
+        </w:tc>
+        <w:tc>
+          <w:tcPr>
+            <w:tcW w:type="dxa" w:w="2001"/>
             <w:tcBorders>
               <w:top w:val="single" w:color="CCD4CC" w:sz="4"/>
               <w:left w:val="single" w:color="CCD4CC" w:sz="4"/>
@@ -9553,7 +9572,7 @@
         </w:trPr>
         <w:tc>
           <w:tcPr>
-            <w:tcW w:type="dxa" w:w="2961"/>
+            <w:tcW w:type="dxa" w:w="3044"/>
             <w:tcBorders>
               <w:top w:val="single" w:color="CCD4CC" w:sz="4"/>
               <w:left w:val="single" w:color="CCD4CC" w:sz="4"/>
@@ -9583,7 +9602,7 @@
         </w:tc>
         <w:tc>
           <w:tcPr>
-            <w:tcW w:type="dxa" w:w="1607"/>
+            <w:tcW w:type="dxa" w:w="1652"/>
             <w:tcBorders>
               <w:top w:val="single" w:color="CCD4CC" w:sz="4"/>
               <w:left w:val="single" w:color="CCD4CC" w:sz="4"/>
@@ -9613,61 +9632,61 @@
         </w:tc>
         <w:tc>
           <w:tcPr>
-            <w:tcW w:type="dxa" w:w="2453"/>
-            <w:tcBorders>
-              <w:top w:val="single" w:color="CCD4CC" w:sz="4"/>
-              <w:left w:val="single" w:color="CCD4CC" w:sz="4"/>
-              <w:bottom w:val="single" w:color="CCD4CC" w:sz="4"/>
-              <w:right w:val="single" w:color="CCD4CC" w:sz="4"/>
-            </w:tcBorders>
-            <w:tcMar>
-              <w:top w:type="dxa" w:w="60"/>
-              <w:left w:type="dxa" w:w="100"/>
-              <w:bottom w:type="dxa" w:w="60"/>
-              <w:right w:type="dxa" w:w="100"/>
-            </w:tcMar>
-          </w:tcPr>
-          <w:p>
-            <w:pPr>
-              <w:spacing w:after="0"/>
-            </w:pPr>
-            <w:r>
-              <w:rPr>
-                <w:color w:val="14251F"/>
-                <w:sz w:val="18"/>
-                <w:szCs w:val="18"/>
-              </w:rPr>
-              <w:t xml:space="preserve">2, 2, 2, 2, 2, 1, 1</w:t>
-            </w:r>
-          </w:p>
-        </w:tc>
-        <w:tc>
-          <w:tcPr>
-            <w:tcW w:type="dxa" w:w="2285"/>
-            <w:tcBorders>
-              <w:top w:val="single" w:color="CCD4CC" w:sz="4"/>
-              <w:left w:val="single" w:color="CCD4CC" w:sz="4"/>
-              <w:bottom w:val="single" w:color="CCD4CC" w:sz="4"/>
-              <w:right w:val="single" w:color="CCD4CC" w:sz="4"/>
-            </w:tcBorders>
-            <w:tcMar>
-              <w:top w:type="dxa" w:w="60"/>
-              <w:left w:type="dxa" w:w="100"/>
-              <w:bottom w:type="dxa" w:w="60"/>
-              <w:right w:type="dxa" w:w="100"/>
-            </w:tcMar>
-          </w:tcPr>
-          <w:p>
-            <w:pPr>
-              <w:spacing w:after="0"/>
-            </w:pPr>
-            <w:r>
-              <w:rPr>
-                <w:color w:val="14251F"/>
-                <w:sz w:val="18"/>
-                <w:szCs w:val="18"/>
-              </w:rPr>
-              <w:t xml:space="preserve">44.7 °C, Jamshedpur, 30 Apr</w:t>
+            <w:tcW w:type="dxa" w:w="2609"/>
+            <w:tcBorders>
+              <w:top w:val="single" w:color="CCD4CC" w:sz="4"/>
+              <w:left w:val="single" w:color="CCD4CC" w:sz="4"/>
+              <w:bottom w:val="single" w:color="CCD4CC" w:sz="4"/>
+              <w:right w:val="single" w:color="CCD4CC" w:sz="4"/>
+            </w:tcBorders>
+            <w:tcMar>
+              <w:top w:type="dxa" w:w="60"/>
+              <w:left w:type="dxa" w:w="100"/>
+              <w:bottom w:type="dxa" w:w="60"/>
+              <w:right w:type="dxa" w:w="100"/>
+            </w:tcMar>
+          </w:tcPr>
+          <w:p>
+            <w:pPr>
+              <w:spacing w:after="0"/>
+            </w:pPr>
+            <w:r>
+              <w:rPr>
+                <w:color w:val="14251F"/>
+                <w:sz w:val="18"/>
+                <w:szCs w:val="18"/>
+              </w:rPr>
+              <w:t xml:space="preserve">33, 33, 33, 33, 33, 29, 25</w:t>
+            </w:r>
+          </w:p>
+        </w:tc>
+        <w:tc>
+          <w:tcPr>
+            <w:tcW w:type="dxa" w:w="2001"/>
+            <w:tcBorders>
+              <w:top w:val="single" w:color="CCD4CC" w:sz="4"/>
+              <w:left w:val="single" w:color="CCD4CC" w:sz="4"/>
+              <w:bottom w:val="single" w:color="CCD4CC" w:sz="4"/>
+              <w:right w:val="single" w:color="CCD4CC" w:sz="4"/>
+            </w:tcBorders>
+            <w:tcMar>
+              <w:top w:type="dxa" w:w="60"/>
+              <w:left w:type="dxa" w:w="100"/>
+              <w:bottom w:type="dxa" w:w="60"/>
+              <w:right w:type="dxa" w:w="100"/>
+            </w:tcMar>
+          </w:tcPr>
+          <w:p>
+            <w:pPr>
+              <w:spacing w:after="0"/>
+            </w:pPr>
+            <w:r>
+              <w:rPr>
+                <w:color w:val="14251F"/>
+                <w:sz w:val="18"/>
+                <w:szCs w:val="18"/>
+              </w:rPr>
+              <w:t xml:space="preserve">46.1 °C, Guntur, 1 May</w:t>
             </w:r>
           </w:p>
         </w:tc>
@@ -9678,7 +9697,7 @@
         </w:trPr>
         <w:tc>
           <w:tcPr>
-            <w:tcW w:type="dxa" w:w="2961"/>
+            <w:tcW w:type="dxa" w:w="3044"/>
             <w:tcBorders>
               <w:top w:val="single" w:color="CCD4CC" w:sz="4"/>
               <w:left w:val="single" w:color="CCD4CC" w:sz="4"/>
@@ -9708,7 +9727,7 @@
         </w:tc>
         <w:tc>
           <w:tcPr>
-            <w:tcW w:type="dxa" w:w="1607"/>
+            <w:tcW w:type="dxa" w:w="1652"/>
             <w:tcBorders>
               <w:top w:val="single" w:color="CCD4CC" w:sz="4"/>
               <w:left w:val="single" w:color="CCD4CC" w:sz="4"/>
@@ -9738,61 +9757,61 @@
         </w:tc>
         <w:tc>
           <w:tcPr>
-            <w:tcW w:type="dxa" w:w="2453"/>
-            <w:tcBorders>
-              <w:top w:val="single" w:color="CCD4CC" w:sz="4"/>
-              <w:left w:val="single" w:color="CCD4CC" w:sz="4"/>
-              <w:bottom w:val="single" w:color="CCD4CC" w:sz="4"/>
-              <w:right w:val="single" w:color="CCD4CC" w:sz="4"/>
-            </w:tcBorders>
-            <w:tcMar>
-              <w:top w:type="dxa" w:w="60"/>
-              <w:left w:type="dxa" w:w="100"/>
-              <w:bottom w:type="dxa" w:w="60"/>
-              <w:right w:type="dxa" w:w="100"/>
-            </w:tcMar>
-          </w:tcPr>
-          <w:p>
-            <w:pPr>
-              <w:spacing w:after="0"/>
-            </w:pPr>
-            <w:r>
-              <w:rPr>
-                <w:color w:val="14251F"/>
-                <w:sz w:val="18"/>
-                <w:szCs w:val="18"/>
-              </w:rPr>
-              <w:t xml:space="preserve">1, 1, 2, 1, 1, 0, 0</w:t>
-            </w:r>
-          </w:p>
-        </w:tc>
-        <w:tc>
-          <w:tcPr>
-            <w:tcW w:type="dxa" w:w="2285"/>
-            <w:tcBorders>
-              <w:top w:val="single" w:color="CCD4CC" w:sz="4"/>
-              <w:left w:val="single" w:color="CCD4CC" w:sz="4"/>
-              <w:bottom w:val="single" w:color="CCD4CC" w:sz="4"/>
-              <w:right w:val="single" w:color="CCD4CC" w:sz="4"/>
-            </w:tcBorders>
-            <w:tcMar>
-              <w:top w:type="dxa" w:w="60"/>
-              <w:left w:type="dxa" w:w="100"/>
-              <w:bottom w:type="dxa" w:w="60"/>
-              <w:right w:type="dxa" w:w="100"/>
-            </w:tcMar>
-          </w:tcPr>
-          <w:p>
-            <w:pPr>
-              <w:spacing w:after="0"/>
-            </w:pPr>
-            <w:r>
-              <w:rPr>
-                <w:color w:val="14251F"/>
-                <w:sz w:val="18"/>
-                <w:szCs w:val="18"/>
-              </w:rPr>
-              <w:t xml:space="preserve">44.7 °C, Gaya, 15 Jun</w:t>
+            <w:tcW w:type="dxa" w:w="2609"/>
+            <w:tcBorders>
+              <w:top w:val="single" w:color="CCD4CC" w:sz="4"/>
+              <w:left w:val="single" w:color="CCD4CC" w:sz="4"/>
+              <w:bottom w:val="single" w:color="CCD4CC" w:sz="4"/>
+              <w:right w:val="single" w:color="CCD4CC" w:sz="4"/>
+            </w:tcBorders>
+            <w:tcMar>
+              <w:top w:type="dxa" w:w="60"/>
+              <w:left w:type="dxa" w:w="100"/>
+              <w:bottom w:type="dxa" w:w="60"/>
+              <w:right w:type="dxa" w:w="100"/>
+            </w:tcMar>
+          </w:tcPr>
+          <w:p>
+            <w:pPr>
+              <w:spacing w:after="0"/>
+            </w:pPr>
+            <w:r>
+              <w:rPr>
+                <w:color w:val="14251F"/>
+                <w:sz w:val="18"/>
+                <w:szCs w:val="18"/>
+              </w:rPr>
+              <w:t xml:space="preserve">15, 15, 23, 15, 12, 5, 5</w:t>
+            </w:r>
+          </w:p>
+        </w:tc>
+        <w:tc>
+          <w:tcPr>
+            <w:tcW w:type="dxa" w:w="2001"/>
+            <w:tcBorders>
+              <w:top w:val="single" w:color="CCD4CC" w:sz="4"/>
+              <w:left w:val="single" w:color="CCD4CC" w:sz="4"/>
+              <w:bottom w:val="single" w:color="CCD4CC" w:sz="4"/>
+              <w:right w:val="single" w:color="CCD4CC" w:sz="4"/>
+            </w:tcBorders>
+            <w:tcMar>
+              <w:top w:type="dxa" w:w="60"/>
+              <w:left w:type="dxa" w:w="100"/>
+              <w:bottom w:type="dxa" w:w="60"/>
+              <w:right w:type="dxa" w:w="100"/>
+            </w:tcMar>
+          </w:tcPr>
+          <w:p>
+            <w:pPr>
+              <w:spacing w:after="0"/>
+            </w:pPr>
+            <w:r>
+              <w:rPr>
+                <w:color w:val="14251F"/>
+                <w:sz w:val="18"/>
+                <w:szCs w:val="18"/>
+              </w:rPr>
+              <w:t xml:space="preserve">45.0 °C, Nawada, 15 Jun</w:t>
             </w:r>
           </w:p>
         </w:tc>
@@ -9803,7 +9822,7 @@
         </w:trPr>
         <w:tc>
           <w:tcPr>
-            <w:tcW w:type="dxa" w:w="2961"/>
+            <w:tcW w:type="dxa" w:w="3044"/>
             <w:tcBorders>
               <w:top w:val="single" w:color="CCD4CC" w:sz="4"/>
               <w:left w:val="single" w:color="CCD4CC" w:sz="4"/>
@@ -9833,7 +9852,7 @@
         </w:tc>
         <w:tc>
           <w:tcPr>
-            <w:tcW w:type="dxa" w:w="1607"/>
+            <w:tcW w:type="dxa" w:w="1652"/>
             <w:tcBorders>
               <w:top w:val="single" w:color="CCD4CC" w:sz="4"/>
               <w:left w:val="single" w:color="CCD4CC" w:sz="4"/>
@@ -9863,61 +9882,61 @@
         </w:tc>
         <w:tc>
           <w:tcPr>
-            <w:tcW w:type="dxa" w:w="2453"/>
-            <w:tcBorders>
-              <w:top w:val="single" w:color="CCD4CC" w:sz="4"/>
-              <w:left w:val="single" w:color="CCD4CC" w:sz="4"/>
-              <w:bottom w:val="single" w:color="CCD4CC" w:sz="4"/>
-              <w:right w:val="single" w:color="CCD4CC" w:sz="4"/>
-            </w:tcBorders>
-            <w:tcMar>
-              <w:top w:type="dxa" w:w="60"/>
-              <w:left w:type="dxa" w:w="100"/>
-              <w:bottom w:type="dxa" w:w="60"/>
-              <w:right w:type="dxa" w:w="100"/>
-            </w:tcMar>
-          </w:tcPr>
-          <w:p>
-            <w:pPr>
-              <w:spacing w:after="0"/>
-            </w:pPr>
-            <w:r>
-              <w:rPr>
-                <w:color w:val="14251F"/>
-                <w:sz w:val="18"/>
-                <w:szCs w:val="18"/>
-              </w:rPr>
-              <w:t xml:space="preserve">0, 0, 1, 1, 0, 2, 0</w:t>
-            </w:r>
-          </w:p>
-        </w:tc>
-        <w:tc>
-          <w:tcPr>
-            <w:tcW w:type="dxa" w:w="2285"/>
-            <w:tcBorders>
-              <w:top w:val="single" w:color="CCD4CC" w:sz="4"/>
-              <w:left w:val="single" w:color="CCD4CC" w:sz="4"/>
-              <w:bottom w:val="single" w:color="CCD4CC" w:sz="4"/>
-              <w:right w:val="single" w:color="CCD4CC" w:sz="4"/>
-            </w:tcBorders>
-            <w:tcMar>
-              <w:top w:type="dxa" w:w="60"/>
-              <w:left w:type="dxa" w:w="100"/>
-              <w:bottom w:type="dxa" w:w="60"/>
-              <w:right w:type="dxa" w:w="100"/>
-            </w:tcMar>
-          </w:tcPr>
-          <w:p>
-            <w:pPr>
-              <w:spacing w:after="0"/>
-            </w:pPr>
-            <w:r>
-              <w:rPr>
-                <w:color w:val="14251F"/>
-                <w:sz w:val="18"/>
-                <w:szCs w:val="18"/>
-              </w:rPr>
-              <w:t xml:space="preserve">45.5 °C, Vijayawada, 22 May</w:t>
+            <w:tcW w:type="dxa" w:w="2609"/>
+            <w:tcBorders>
+              <w:top w:val="single" w:color="CCD4CC" w:sz="4"/>
+              <w:left w:val="single" w:color="CCD4CC" w:sz="4"/>
+              <w:bottom w:val="single" w:color="CCD4CC" w:sz="4"/>
+              <w:right w:val="single" w:color="CCD4CC" w:sz="4"/>
+            </w:tcBorders>
+            <w:tcMar>
+              <w:top w:type="dxa" w:w="60"/>
+              <w:left w:type="dxa" w:w="100"/>
+              <w:bottom w:type="dxa" w:w="60"/>
+              <w:right w:type="dxa" w:w="100"/>
+            </w:tcMar>
+          </w:tcPr>
+          <w:p>
+            <w:pPr>
+              <w:spacing w:after="0"/>
+            </w:pPr>
+            <w:r>
+              <w:rPr>
+                <w:color w:val="14251F"/>
+                <w:sz w:val="18"/>
+                <w:szCs w:val="18"/>
+              </w:rPr>
+              <w:t xml:space="preserve">3, 5, 4, 4, 3, 6, 3</w:t>
+            </w:r>
+          </w:p>
+        </w:tc>
+        <w:tc>
+          <w:tcPr>
+            <w:tcW w:type="dxa" w:w="2001"/>
+            <w:tcBorders>
+              <w:top w:val="single" w:color="CCD4CC" w:sz="4"/>
+              <w:left w:val="single" w:color="CCD4CC" w:sz="4"/>
+              <w:bottom w:val="single" w:color="CCD4CC" w:sz="4"/>
+              <w:right w:val="single" w:color="CCD4CC" w:sz="4"/>
+            </w:tcBorders>
+            <w:tcMar>
+              <w:top w:type="dxa" w:w="60"/>
+              <w:left w:type="dxa" w:w="100"/>
+              <w:bottom w:type="dxa" w:w="60"/>
+              <w:right w:type="dxa" w:w="100"/>
+            </w:tcMar>
+          </w:tcPr>
+          <w:p>
+            <w:pPr>
+              <w:spacing w:after="0"/>
+            </w:pPr>
+            <w:r>
+              <w:rPr>
+                <w:color w:val="14251F"/>
+                <w:sz w:val="18"/>
+                <w:szCs w:val="18"/>
+              </w:rPr>
+              <w:t xml:space="preserve">46.5 °C, Guntur, 21 May</w:t>
             </w:r>
           </w:p>
         </w:tc>
@@ -13205,10 +13224,22 @@
           <w:b/>
           <w:bCs/>
         </w:rPr>
-        <w:t xml:space="preserve">Adding districts:</w:t>
-      </w:r>
-      <w:r>
-        <w:t xml:space="preserve"> add entries (id, name, state, forecast point, climate zone, Census 2011 codes) to </w:t>
+        <w:t xml:space="preserve">District list:</w:t>
+      </w:r>
+      <w:r>
+        <w:t xml:space="preserve"> </w:t>
+      </w:r>
+      <w:r>
+        <w:rPr>
+          <w:rFonts w:ascii="Consolas" w:cs="Consolas" w:eastAsia="Consolas" w:hAnsi="Consolas"/>
+          <w:color w:val="173E32"/>
+          <w:sz w:val="18"/>
+          <w:szCs w:val="18"/>
+        </w:rPr>
+        <w:t xml:space="preserve">scripts/build_all_districts.py</w:t>
+      </w:r>
+      <w:r>
+        <w:t xml:space="preserve"> builds </w:t>
       </w:r>
       <w:r>
         <w:rPr>
@@ -13220,7 +13251,7 @@
         <w:t xml:space="preserve">config/districts.yaml</w:t>
       </w:r>
       <w:r>
-        <w:t xml:space="preserve">, regenerate </w:t>
+        <w:t xml:space="preserve"> and </w:t>
       </w:r>
       <w:r>
         <w:rPr>
@@ -13232,7 +13263,43 @@
         <w:t xml:space="preserve">config/pilot_districts.geojson</w:t>
       </w:r>
       <w:r>
-        <w:t xml:space="preserve"> from the pinned Census 2011 shapefile, then run the pipeline (normals load for missing districts only), recompute replays, retrain, and run </w:t>
+        <w:t xml:space="preserve"> from the Census 2011 shapefile (points, zones, state names). After changing districts: </w:t>
+      </w:r>
+      <w:r>
+        <w:rPr>
+          <w:rFonts w:ascii="Consolas" w:cs="Consolas" w:eastAsia="Consolas" w:hAnsi="Consolas"/>
+          <w:color w:val="173E32"/>
+          <w:sz w:val="18"/>
+          <w:szCs w:val="18"/>
+        </w:rPr>
+        <w:t xml:space="preserve">python -m pipeline.climatology cds</w:t>
+      </w:r>
+      <w:r>
+        <w:t xml:space="preserve"> (normals), run the pipeline, </w:t>
+      </w:r>
+      <w:r>
+        <w:rPr>
+          <w:rFonts w:ascii="Consolas" w:cs="Consolas" w:eastAsia="Consolas" w:hAnsi="Consolas"/>
+          <w:color w:val="173E32"/>
+          <w:sz w:val="18"/>
+          <w:szCs w:val="18"/>
+        </w:rPr>
+        <w:t xml:space="preserve">python -m pipeline.replay</w:t>
+      </w:r>
+      <w:r>
+        <w:t xml:space="preserve">, optionally </w:t>
+      </w:r>
+      <w:r>
+        <w:rPr>
+          <w:rFonts w:ascii="Consolas" w:cs="Consolas" w:eastAsia="Consolas" w:hAnsi="Consolas"/>
+          <w:color w:val="173E32"/>
+          <w:sz w:val="18"/>
+          <w:szCs w:val="18"/>
+        </w:rPr>
+        <w:t xml:space="preserve">python -m models.train_bias</w:t>
+      </w:r>
+      <w:r>
+        <w:t xml:space="preserve">, then </w:t>
       </w:r>
       <w:r>
         <w:rPr>
@@ -13435,7 +13502,7 @@
         </w:numPr>
       </w:pPr>
       <w:r>
-        <w:t xml:space="preserve">Climate zones for each district were assigned by the team, not by IMD.</w:t>
+        <w:t xml:space="preserve">Climate zones come from a terrain rule (and, for 81 districts, the team), not from IMD.</w:t>
       </w:r>
     </w:p>
     <w:p>
@@ -13492,10 +13559,10 @@
           <w:b/>
           <w:bCs/>
         </w:rPr>
-        <w:t xml:space="preserve">All-India coverage</w:t>
-      </w:r>
-      <w:r>
-        <w:t xml:space="preserve"> (641 Census 2011 districts): normals from a single Copernicus ERA5 download with district-average statistics instead of point values.</w:t>
+        <w:t xml:space="preserve">Current district boundaries</w:t>
+      </w:r>
+      <w:r>
+        <w:t xml:space="preserve"> (~780 districts): needs an official post-2011 boundary set.</w:t>
       </w:r>
     </w:p>
     <w:p>

</xml_diff>